<commit_message>
Update BOL template and add departure_date/loading_date fields
- Replace BILL_OF_LADING_TEMPLATE.docx with new version containing 2 new
  placeholders: «departure_date» and «loading_date»
- Update cargo_router.py BOL generation to populate these new fields:
  departure_date from ATD (fallback ETD), loading_date from batch or ETD

https://claude.ai/code/session_019RCrzMHfeMepsziv69i884
</commit_message>
<xml_diff>
--- a/app/static/BILL_OF_LADING_TEMPLATE.docx
+++ b/app/static/BILL_OF_LADING_TEMPLATE.docx
@@ -165,7 +165,7 @@
                           <pic:cNvPicPr/>
                         </pic:nvPicPr>
                         <pic:blipFill>
-                          <a:blip r:embed="rId9" cstate="print"/>
+                          <a:blip r:embed="rId11" cstate="print"/>
                           <a:stretch>
                             <a:fillRect/>
                           </a:stretch>
@@ -2077,7 +2077,6 @@
                 <w:spacing w:val="-2"/>
                 <w:sz w:val="16"/>
                 <w:szCs w:val="16"/>
-                <w:lang w:val="de-DE"/>
               </w:rPr>
             </w:pPr>
             <w:r>
@@ -2149,6 +2148,16 @@
                 <w:szCs w:val="16"/>
               </w:rPr>
               <w:t xml:space="preserve"> in</w:t>
+            </w:r>
+            <w:r>
+              <w:rPr>
+                <w:rFonts w:ascii="Miriam Fixed" w:hAnsi="Miriam Fixed" w:cs="Miriam Fixed"/>
+                <w:noProof/>
+                <w:spacing w:val="-2"/>
+                <w:sz w:val="16"/>
+                <w:szCs w:val="16"/>
+              </w:rPr>
+              <w:t xml:space="preserve"> </w:t>
             </w:r>
             <w:r>
               <w:rPr>
@@ -2159,7 +2168,17 @@
                 <w:szCs w:val="16"/>
                 <w:lang w:val="de-DE"/>
               </w:rPr>
-              <w:t xml:space="preserve"> </w:t>
+              <w:fldChar w:fldCharType="begin"/>
+            </w:r>
+            <w:r>
+              <w:rPr>
+                <w:rFonts w:ascii="Miriam Fixed" w:hAnsi="Miriam Fixed" w:cs="Miriam Fixed"/>
+                <w:noProof/>
+                <w:spacing w:val="-2"/>
+                <w:sz w:val="16"/>
+                <w:szCs w:val="16"/>
+              </w:rPr>
+              <w:instrText xml:space="preserve"> MERGEFIELD Nombre_de_PALLET_ID </w:instrText>
             </w:r>
             <w:r>
               <w:rPr>
@@ -2170,7 +2189,17 @@
                 <w:szCs w:val="16"/>
                 <w:lang w:val="de-DE"/>
               </w:rPr>
-              <w:fldChar w:fldCharType="begin"/>
+              <w:fldChar w:fldCharType="separate"/>
+            </w:r>
+            <w:r>
+              <w:rPr>
+                <w:rFonts w:ascii="Miriam Fixed" w:hAnsi="Miriam Fixed" w:cs="Miriam Fixed"/>
+                <w:noProof/>
+                <w:spacing w:val="-2"/>
+                <w:sz w:val="16"/>
+                <w:szCs w:val="16"/>
+              </w:rPr>
+              <w:t>«Nombre_de_PALLET_ID»</w:t>
             </w:r>
             <w:r>
               <w:rPr>
@@ -2181,7 +2210,47 @@
                 <w:szCs w:val="16"/>
                 <w:lang w:val="de-DE"/>
               </w:rPr>
-              <w:instrText xml:space="preserve"> MERGEFIELD Nombre_de_PALLET_ID </w:instrText>
+              <w:fldChar w:fldCharType="end"/>
+            </w:r>
+            <w:r>
+              <w:rPr>
+                <w:rFonts w:ascii="Miriam Fixed" w:hAnsi="Miriam Fixed" w:cs="Miriam Fixed"/>
+                <w:noProof/>
+                <w:spacing w:val="-2"/>
+                <w:sz w:val="16"/>
+                <w:szCs w:val="16"/>
+              </w:rPr>
+              <w:t xml:space="preserve"> pallets</w:t>
+            </w:r>
+            <w:r>
+              <w:rPr>
+                <w:rFonts w:ascii="Miriam Fixed" w:hAnsi="Miriam Fixed" w:cs="Miriam Fixed"/>
+                <w:noProof/>
+                <w:spacing w:val="-2"/>
+                <w:sz w:val="16"/>
+                <w:szCs w:val="16"/>
+              </w:rPr>
+              <w:t xml:space="preserve"> </w:t>
+            </w:r>
+            <w:r>
+              <w:rPr>
+                <w:rFonts w:ascii="Miriam Fixed" w:hAnsi="Miriam Fixed" w:cs="Miriam Fixed"/>
+                <w:noProof/>
+                <w:spacing w:val="-2"/>
+                <w:sz w:val="16"/>
+                <w:szCs w:val="16"/>
+              </w:rPr>
+              <w:t>of</w:t>
+            </w:r>
+            <w:r>
+              <w:rPr>
+                <w:rFonts w:ascii="Miriam Fixed" w:hAnsi="Miriam Fixed" w:cs="Miriam Fixed"/>
+                <w:noProof/>
+                <w:spacing w:val="-2"/>
+                <w:sz w:val="16"/>
+                <w:szCs w:val="16"/>
+              </w:rPr>
+              <w:t xml:space="preserve"> </w:t>
             </w:r>
             <w:r>
               <w:rPr>
@@ -2192,7 +2261,17 @@
                 <w:szCs w:val="16"/>
                 <w:lang w:val="de-DE"/>
               </w:rPr>
-              <w:fldChar w:fldCharType="separate"/>
+              <w:fldChar w:fldCharType="begin"/>
+            </w:r>
+            <w:r>
+              <w:rPr>
+                <w:rFonts w:ascii="Miriam Fixed" w:hAnsi="Miriam Fixed" w:cs="Miriam Fixed"/>
+                <w:noProof/>
+                <w:spacing w:val="-2"/>
+                <w:sz w:val="16"/>
+                <w:szCs w:val="16"/>
+              </w:rPr>
+              <w:instrText xml:space="preserve"> MERGEFIELD "TYPE_OF_GOODS" </w:instrText>
             </w:r>
             <w:r>
               <w:rPr>
@@ -2203,7 +2282,7 @@
                 <w:szCs w:val="16"/>
                 <w:lang w:val="de-DE"/>
               </w:rPr>
-              <w:t>«Nombre_de_PALLET_ID»</w:t>
+              <w:fldChar w:fldCharType="separate"/>
             </w:r>
             <w:r>
               <w:rPr>
@@ -2212,95 +2291,6 @@
                 <w:spacing w:val="-2"/>
                 <w:sz w:val="16"/>
                 <w:szCs w:val="16"/>
-                <w:lang w:val="de-DE"/>
-              </w:rPr>
-              <w:fldChar w:fldCharType="end"/>
-            </w:r>
-            <w:r>
-              <w:rPr>
-                <w:rFonts w:ascii="Miriam Fixed" w:hAnsi="Miriam Fixed" w:cs="Miriam Fixed"/>
-                <w:noProof/>
-                <w:spacing w:val="-2"/>
-                <w:sz w:val="16"/>
-                <w:szCs w:val="16"/>
-                <w:lang w:val="de-DE"/>
-              </w:rPr>
-              <w:t xml:space="preserve"> pallets</w:t>
-            </w:r>
-            <w:r>
-              <w:rPr>
-                <w:rFonts w:ascii="Miriam Fixed" w:hAnsi="Miriam Fixed" w:cs="Miriam Fixed"/>
-                <w:noProof/>
-                <w:spacing w:val="-2"/>
-                <w:sz w:val="16"/>
-                <w:szCs w:val="16"/>
-                <w:lang w:val="de-DE"/>
-              </w:rPr>
-              <w:t xml:space="preserve"> </w:t>
-            </w:r>
-            <w:r>
-              <w:rPr>
-                <w:rFonts w:ascii="Miriam Fixed" w:hAnsi="Miriam Fixed" w:cs="Miriam Fixed"/>
-                <w:noProof/>
-                <w:spacing w:val="-2"/>
-                <w:sz w:val="16"/>
-                <w:szCs w:val="16"/>
-                <w:lang w:val="de-DE"/>
-              </w:rPr>
-              <w:t>of</w:t>
-            </w:r>
-            <w:r>
-              <w:rPr>
-                <w:rFonts w:ascii="Miriam Fixed" w:hAnsi="Miriam Fixed" w:cs="Miriam Fixed"/>
-                <w:noProof/>
-                <w:spacing w:val="-2"/>
-                <w:sz w:val="16"/>
-                <w:szCs w:val="16"/>
-                <w:lang w:val="de-DE"/>
-              </w:rPr>
-              <w:t xml:space="preserve"> </w:t>
-            </w:r>
-            <w:r>
-              <w:rPr>
-                <w:rFonts w:ascii="Miriam Fixed" w:hAnsi="Miriam Fixed" w:cs="Miriam Fixed"/>
-                <w:noProof/>
-                <w:spacing w:val="-2"/>
-                <w:sz w:val="16"/>
-                <w:szCs w:val="16"/>
-                <w:lang w:val="de-DE"/>
-              </w:rPr>
-              <w:fldChar w:fldCharType="begin"/>
-            </w:r>
-            <w:r>
-              <w:rPr>
-                <w:rFonts w:ascii="Miriam Fixed" w:hAnsi="Miriam Fixed" w:cs="Miriam Fixed"/>
-                <w:noProof/>
-                <w:spacing w:val="-2"/>
-                <w:sz w:val="16"/>
-                <w:szCs w:val="16"/>
-                <w:lang w:val="de-DE"/>
-              </w:rPr>
-              <w:instrText xml:space="preserve"> MERGEFIELD "TYPE_OF_GOODS" </w:instrText>
-            </w:r>
-            <w:r>
-              <w:rPr>
-                <w:rFonts w:ascii="Miriam Fixed" w:hAnsi="Miriam Fixed" w:cs="Miriam Fixed"/>
-                <w:noProof/>
-                <w:spacing w:val="-2"/>
-                <w:sz w:val="16"/>
-                <w:szCs w:val="16"/>
-                <w:lang w:val="de-DE"/>
-              </w:rPr>
-              <w:fldChar w:fldCharType="separate"/>
-            </w:r>
-            <w:r>
-              <w:rPr>
-                <w:rFonts w:ascii="Miriam Fixed" w:hAnsi="Miriam Fixed" w:cs="Miriam Fixed"/>
-                <w:noProof/>
-                <w:spacing w:val="-2"/>
-                <w:sz w:val="16"/>
-                <w:szCs w:val="16"/>
-                <w:lang w:val="de-DE"/>
               </w:rPr>
               <w:t>«TYPE_OF_GOODS»</w:t>
             </w:r>
@@ -4666,15 +4656,7 @@
                 <w:w w:val="105"/>
                 <w:sz w:val="15"/>
               </w:rPr>
-              <w:t xml:space="preserve">right, </w:t>
-            </w:r>
-            <w:proofErr w:type="gramStart"/>
-            <w:r>
-              <w:rPr>
-                <w:w w:val="105"/>
-                <w:sz w:val="15"/>
-              </w:rPr>
-              <w:t>all</w:t>
+              <w:t>right, all</w:t>
             </w:r>
             <w:r>
               <w:rPr>
@@ -4689,15 +4671,7 @@
                 <w:w w:val="105"/>
                 <w:sz w:val="15"/>
               </w:rPr>
-              <w:t>of</w:t>
-            </w:r>
-            <w:proofErr w:type="gramEnd"/>
-            <w:r>
-              <w:rPr>
-                <w:w w:val="105"/>
-                <w:sz w:val="15"/>
-              </w:rPr>
-              <w:t xml:space="preserve"> this t</w:t>
+              <w:t>of this t</w:t>
             </w:r>
             <w:r>
               <w:rPr>
@@ -4775,7 +4749,6 @@
               <w:t xml:space="preserve">and </w:t>
             </w:r>
             <w:proofErr w:type="spellStart"/>
-            <w:proofErr w:type="gramStart"/>
             <w:r>
               <w:rPr>
                 <w:w w:val="105"/>
@@ -4792,7 +4765,6 @@
               <w:t>All</w:t>
             </w:r>
             <w:proofErr w:type="spellEnd"/>
-            <w:proofErr w:type="gramEnd"/>
             <w:r>
               <w:rPr>
                 <w:b/>
@@ -5139,6 +5111,18 @@
               </w:rPr>
               <w:t>defendant has his registered office.</w:t>
             </w:r>
+          </w:p>
+          <w:p>
+            <w:pPr>
+              <w:pStyle w:val="TableParagraph"/>
+              <w:spacing w:before="137" w:line="266" w:lineRule="auto"/>
+              <w:ind w:left="192" w:right="153"/>
+              <w:jc w:val="both"/>
+              <w:rPr>
+                <w:w w:val="105"/>
+                <w:sz w:val="15"/>
+              </w:rPr>
+            </w:pPr>
           </w:p>
         </w:tc>
       </w:tr>
@@ -5166,7 +5150,7 @@
                 <w:spacing w:val="-2"/>
                 <w:sz w:val="16"/>
                 <w:szCs w:val="16"/>
-                <w:lang w:val="de-DE"/>
+                <w:lang w:val="fr-FR"/>
               </w:rPr>
             </w:pPr>
             <w:r>
@@ -5187,7 +5171,7 @@
                 <w:spacing w:val="-2"/>
                 <w:sz w:val="16"/>
                 <w:szCs w:val="16"/>
-                <w:lang w:val="de-DE"/>
+                <w:lang w:val="fr-FR"/>
               </w:rPr>
               <w:instrText xml:space="preserve"> MERGEFIELD Maximum_de_CASES_QUANTITY </w:instrText>
             </w:r>
@@ -5209,7 +5193,7 @@
                 <w:spacing w:val="-2"/>
                 <w:sz w:val="16"/>
                 <w:szCs w:val="16"/>
-                <w:lang w:val="de-DE"/>
+                <w:lang w:val="fr-FR"/>
               </w:rPr>
               <w:t>«Maximum_de_CASES_QUANTITY»</w:t>
             </w:r>
@@ -5231,9 +5215,42 @@
                 <w:spacing w:val="-2"/>
                 <w:sz w:val="16"/>
                 <w:szCs w:val="16"/>
-                <w:lang w:val="de-DE"/>
+                <w:lang w:val="fr-FR"/>
               </w:rPr>
               <w:t xml:space="preserve"> bags</w:t>
+            </w:r>
+            <w:r>
+              <w:rPr>
+                <w:rFonts w:ascii="Miriam Fixed" w:hAnsi="Miriam Fixed" w:cs="Miriam Fixed"/>
+                <w:noProof/>
+                <w:spacing w:val="-2"/>
+                <w:sz w:val="16"/>
+                <w:szCs w:val="16"/>
+                <w:lang w:val="fr-FR"/>
+              </w:rPr>
+              <w:t xml:space="preserve"> </w:t>
+            </w:r>
+            <w:r>
+              <w:rPr>
+                <w:rFonts w:ascii="Miriam Fixed" w:hAnsi="Miriam Fixed" w:cs="Miriam Fixed" w:hint="cs"/>
+                <w:noProof/>
+                <w:spacing w:val="-2"/>
+                <w:sz w:val="16"/>
+                <w:szCs w:val="16"/>
+                <w:lang w:val="fr-FR"/>
+              </w:rPr>
+              <w:t>stowed on</w:t>
+            </w:r>
+            <w:r>
+              <w:rPr>
+                <w:rFonts w:ascii="Miriam Fixed" w:hAnsi="Miriam Fixed" w:cs="Miriam Fixed"/>
+                <w:noProof/>
+                <w:spacing w:val="-2"/>
+                <w:sz w:val="16"/>
+                <w:szCs w:val="16"/>
+                <w:lang w:val="fr-FR"/>
+              </w:rPr>
+              <w:t xml:space="preserve"> </w:t>
             </w:r>
             <w:r>
               <w:rPr>
@@ -5244,18 +5261,18 @@
                 <w:szCs w:val="16"/>
                 <w:lang w:val="de-DE"/>
               </w:rPr>
-              <w:t xml:space="preserve"> </w:t>
-            </w:r>
-            <w:r>
-              <w:rPr>
-                <w:rFonts w:ascii="Miriam Fixed" w:hAnsi="Miriam Fixed" w:cs="Miriam Fixed" w:hint="cs"/>
+              <w:fldChar w:fldCharType="begin"/>
+            </w:r>
+            <w:r>
+              <w:rPr>
+                <w:rFonts w:ascii="Miriam Fixed" w:hAnsi="Miriam Fixed" w:cs="Miriam Fixed"/>
                 <w:noProof/>
                 <w:spacing w:val="-2"/>
                 <w:sz w:val="16"/>
                 <w:szCs w:val="16"/>
-                <w:lang w:val="de-DE"/>
-              </w:rPr>
-              <w:t>stowed on</w:t>
+                <w:lang w:val="fr-FR"/>
+              </w:rPr>
+              <w:instrText xml:space="preserve"> MERGEFIELD Nombre_de_PALLET_ID </w:instrText>
             </w:r>
             <w:r>
               <w:rPr>
@@ -5266,7 +5283,18 @@
                 <w:szCs w:val="16"/>
                 <w:lang w:val="de-DE"/>
               </w:rPr>
-              <w:t xml:space="preserve"> </w:t>
+              <w:fldChar w:fldCharType="separate"/>
+            </w:r>
+            <w:r>
+              <w:rPr>
+                <w:rFonts w:ascii="Miriam Fixed" w:hAnsi="Miriam Fixed" w:cs="Miriam Fixed"/>
+                <w:noProof/>
+                <w:spacing w:val="-2"/>
+                <w:sz w:val="16"/>
+                <w:szCs w:val="16"/>
+                <w:lang w:val="fr-FR"/>
+              </w:rPr>
+              <w:t>«Nombre_de_PALLET_ID»</w:t>
             </w:r>
             <w:r>
               <w:rPr>
@@ -5277,7 +5305,18 @@
                 <w:szCs w:val="16"/>
                 <w:lang w:val="de-DE"/>
               </w:rPr>
-              <w:fldChar w:fldCharType="begin"/>
+              <w:fldChar w:fldCharType="end"/>
+            </w:r>
+            <w:r>
+              <w:rPr>
+                <w:rFonts w:ascii="Miriam Fixed" w:hAnsi="Miriam Fixed" w:cs="Miriam Fixed" w:hint="cs"/>
+                <w:noProof/>
+                <w:spacing w:val="-2"/>
+                <w:sz w:val="16"/>
+                <w:szCs w:val="16"/>
+                <w:lang w:val="fr-FR"/>
+              </w:rPr>
+              <w:t xml:space="preserve"> </w:t>
             </w:r>
             <w:r>
               <w:rPr>
@@ -5286,62 +5325,7 @@
                 <w:spacing w:val="-2"/>
                 <w:sz w:val="16"/>
                 <w:szCs w:val="16"/>
-                <w:lang w:val="de-DE"/>
-              </w:rPr>
-              <w:instrText xml:space="preserve"> MERGEFIELD Nombre_de_PALLET_ID </w:instrText>
-            </w:r>
-            <w:r>
-              <w:rPr>
-                <w:rFonts w:ascii="Miriam Fixed" w:hAnsi="Miriam Fixed" w:cs="Miriam Fixed"/>
-                <w:noProof/>
-                <w:spacing w:val="-2"/>
-                <w:sz w:val="16"/>
-                <w:szCs w:val="16"/>
-                <w:lang w:val="de-DE"/>
-              </w:rPr>
-              <w:fldChar w:fldCharType="separate"/>
-            </w:r>
-            <w:r>
-              <w:rPr>
-                <w:rFonts w:ascii="Miriam Fixed" w:hAnsi="Miriam Fixed" w:cs="Miriam Fixed"/>
-                <w:noProof/>
-                <w:spacing w:val="-2"/>
-                <w:sz w:val="16"/>
-                <w:szCs w:val="16"/>
-                <w:lang w:val="de-DE"/>
-              </w:rPr>
-              <w:t>«Nombre_de_PALLET_ID»</w:t>
-            </w:r>
-            <w:r>
-              <w:rPr>
-                <w:rFonts w:ascii="Miriam Fixed" w:hAnsi="Miriam Fixed" w:cs="Miriam Fixed"/>
-                <w:noProof/>
-                <w:spacing w:val="-2"/>
-                <w:sz w:val="16"/>
-                <w:szCs w:val="16"/>
-                <w:lang w:val="de-DE"/>
-              </w:rPr>
-              <w:fldChar w:fldCharType="end"/>
-            </w:r>
-            <w:r>
-              <w:rPr>
-                <w:rFonts w:ascii="Miriam Fixed" w:hAnsi="Miriam Fixed" w:cs="Miriam Fixed" w:hint="cs"/>
-                <w:noProof/>
-                <w:spacing w:val="-2"/>
-                <w:sz w:val="16"/>
-                <w:szCs w:val="16"/>
-                <w:lang w:val="de-DE"/>
-              </w:rPr>
-              <w:t xml:space="preserve"> </w:t>
-            </w:r>
-            <w:r>
-              <w:rPr>
-                <w:rFonts w:ascii="Miriam Fixed" w:hAnsi="Miriam Fixed" w:cs="Miriam Fixed"/>
-                <w:noProof/>
-                <w:spacing w:val="-2"/>
-                <w:sz w:val="16"/>
-                <w:szCs w:val="16"/>
-                <w:lang w:val="de-DE"/>
+                <w:lang w:val="fr-FR"/>
               </w:rPr>
               <w:t>pallets</w:t>
             </w:r>
@@ -5902,12 +5886,6 @@
             <w:pPr>
               <w:pStyle w:val="TableParagraph"/>
               <w:rPr>
-                <w:rFonts w:ascii="Times New Roman"/>
-                <w:sz w:val="14"/>
-              </w:rPr>
-            </w:pPr>
-            <w:r>
-              <w:rPr>
                 <w:rFonts w:ascii="Miriam Fixed" w:hAnsi="Miriam Fixed" w:cs="Miriam Fixed"/>
                 <w:noProof/>
                 <w:spacing w:val="-2"/>
@@ -5915,8 +5893,7 @@
                 <w:szCs w:val="16"/>
                 <w:lang w:val="de-DE"/>
               </w:rPr>
-              <w:t>08</w:t>
-            </w:r>
+            </w:pPr>
             <w:r>
               <w:rPr>
                 <w:rFonts w:ascii="Miriam Fixed" w:hAnsi="Miriam Fixed" w:cs="Miriam Fixed"/>
@@ -5926,40 +5903,7 @@
                 <w:szCs w:val="16"/>
                 <w:lang w:val="de-DE"/>
               </w:rPr>
-              <w:t>/</w:t>
-            </w:r>
-            <w:r>
-              <w:rPr>
-                <w:rFonts w:ascii="Miriam Fixed" w:hAnsi="Miriam Fixed" w:cs="Miriam Fixed"/>
-                <w:noProof/>
-                <w:spacing w:val="-2"/>
-                <w:sz w:val="16"/>
-                <w:szCs w:val="16"/>
-                <w:lang w:val="de-DE"/>
-              </w:rPr>
-              <w:t>04</w:t>
-            </w:r>
-            <w:r>
-              <w:rPr>
-                <w:rFonts w:ascii="Miriam Fixed" w:hAnsi="Miriam Fixed" w:cs="Miriam Fixed"/>
-                <w:noProof/>
-                <w:spacing w:val="-2"/>
-                <w:sz w:val="16"/>
-                <w:szCs w:val="16"/>
-                <w:lang w:val="de-DE"/>
-              </w:rPr>
-              <w:t>/202</w:t>
-            </w:r>
-            <w:r>
-              <w:rPr>
-                <w:rFonts w:ascii="Miriam Fixed" w:hAnsi="Miriam Fixed" w:cs="Miriam Fixed"/>
-                <w:noProof/>
-                <w:spacing w:val="-2"/>
-                <w:sz w:val="16"/>
-                <w:szCs w:val="16"/>
-                <w:lang w:val="de-DE"/>
-              </w:rPr>
-              <w:t>5</w:t>
+              <w:t>&lt;loading_date&gt;</w:t>
             </w:r>
           </w:p>
         </w:tc>
@@ -5970,13 +5914,41 @@
             <w:tcBorders>
               <w:top w:val="nil"/>
               <w:left w:val="single" w:sz="4" w:space="0" w:color="auto"/>
-              <w:bottom w:val="nil"/>
+              <w:bottom w:val="single" w:sz="4" w:space="0" w:color="auto"/>
               <w:right w:val="single" w:sz="4" w:space="0" w:color="auto"/>
             </w:tcBorders>
           </w:tcPr>
           <w:p>
             <w:pPr>
-              <w:pStyle w:val="TableParagraph"/>
+              <w:rPr>
+                <w:rFonts w:ascii="Miriam Fixed" w:hAnsi="Miriam Fixed" w:cs="Miriam Fixed"/>
+                <w:noProof/>
+                <w:spacing w:val="-2"/>
+                <w:sz w:val="16"/>
+                <w:szCs w:val="16"/>
+              </w:rPr>
+            </w:pPr>
+            <w:r>
+              <w:rPr>
+                <w:rFonts w:ascii="Miriam Fixed" w:hAnsi="Miriam Fixed" w:cs="Miriam Fixed"/>
+                <w:noProof/>
+                <w:spacing w:val="-2"/>
+                <w:sz w:val="16"/>
+                <w:szCs w:val="16"/>
+              </w:rPr>
+              <w:t>&lt;departure_date&gt;</w:t>
+            </w:r>
+            <w:r>
+              <w:rPr>
+                <w:rFonts w:ascii="Miriam Fixed" w:hAnsi="Miriam Fixed" w:cs="Miriam Fixed"/>
+                <w:noProof/>
+                <w:spacing w:val="-2"/>
+                <w:sz w:val="16"/>
+                <w:szCs w:val="16"/>
+              </w:rPr>
+              <w:br/>
+            </w:r>
+            <w:r>
               <w:rPr>
                 <w:rFonts w:ascii="Miriam Fixed" w:hAnsi="Miriam Fixed" w:cs="Miriam Fixed"/>
                 <w:noProof/>
@@ -5985,7 +5957,8 @@
                 <w:szCs w:val="16"/>
                 <w:lang w:val="de-DE"/>
               </w:rPr>
-            </w:pPr>
+              <w:fldChar w:fldCharType="begin"/>
+            </w:r>
             <w:r>
               <w:rPr>
                 <w:rFonts w:ascii="Miriam Fixed" w:hAnsi="Miriam Fixed" w:cs="Miriam Fixed"/>
@@ -5995,7 +5968,7 @@
                 <w:szCs w:val="16"/>
                 <w:lang w:val="de-DE"/>
               </w:rPr>
-              <w:t>0</w:t>
+              <w:instrText xml:space="preserve"> MERGEFIELD "POL_NAME" </w:instrText>
             </w:r>
             <w:r>
               <w:rPr>
@@ -6006,7 +5979,7 @@
                 <w:szCs w:val="16"/>
                 <w:lang w:val="de-DE"/>
               </w:rPr>
-              <w:t>9</w:t>
+              <w:fldChar w:fldCharType="separate"/>
             </w:r>
             <w:r>
               <w:rPr>
@@ -6017,7 +5990,7 @@
                 <w:szCs w:val="16"/>
                 <w:lang w:val="de-DE"/>
               </w:rPr>
-              <w:t>/0</w:t>
+              <w:t>«POL_NAME»</w:t>
             </w:r>
             <w:r>
               <w:rPr>
@@ -6028,7 +6001,7 @@
                 <w:szCs w:val="16"/>
                 <w:lang w:val="de-DE"/>
               </w:rPr>
-              <w:t>4</w:t>
+              <w:fldChar w:fldCharType="end"/>
             </w:r>
             <w:r>
               <w:rPr>
@@ -6039,26 +6012,7 @@
                 <w:szCs w:val="16"/>
                 <w:lang w:val="de-DE"/>
               </w:rPr>
-              <w:t xml:space="preserve">/2025 </w:t>
-            </w:r>
-          </w:p>
-          <w:p>
-            <w:pPr>
-              <w:rPr>
-                <w:sz w:val="2"/>
-                <w:szCs w:val="2"/>
-              </w:rPr>
-            </w:pPr>
-            <w:r>
-              <w:rPr>
-                <w:rFonts w:ascii="Miriam Fixed" w:hAnsi="Miriam Fixed" w:cs="Miriam Fixed"/>
-                <w:noProof/>
-                <w:spacing w:val="-2"/>
-                <w:sz w:val="16"/>
-                <w:szCs w:val="16"/>
-                <w:lang w:val="de-DE"/>
-              </w:rPr>
-              <w:t>Brest</w:t>
+              <w:t xml:space="preserve"> , </w:t>
             </w:r>
           </w:p>
         </w:tc>
@@ -6130,6 +6084,7 @@
                 <w:w w:val="105"/>
                 <w:sz w:val="15"/>
               </w:rPr>
+              <w:lastRenderedPageBreak/>
               <w:t xml:space="preserve">Carrier:    </w:t>
             </w:r>
             <w:r>
@@ -6316,23 +6271,13 @@
               </w:rPr>
               <w:t xml:space="preserve">                                                                                   </w:t>
             </w:r>
-            <w:proofErr w:type="gramStart"/>
             <w:r>
               <w:rPr>
                 <w:spacing w:val="-2"/>
                 <w:w w:val="105"/>
                 <w:sz w:val="15"/>
               </w:rPr>
-              <w:t xml:space="preserve">   (</w:t>
-            </w:r>
-            <w:proofErr w:type="gramEnd"/>
-            <w:r>
-              <w:rPr>
-                <w:spacing w:val="-2"/>
-                <w:w w:val="105"/>
-                <w:sz w:val="15"/>
-              </w:rPr>
-              <w:t>Carrier*/Master*/Agent*)</w:t>
+              <w:t xml:space="preserve">   (Carrier*/Master*/Agent*)</w:t>
             </w:r>
           </w:p>
           <w:p>
@@ -6732,35 +6677,45 @@
             <w:pPr>
               <w:pStyle w:val="TableParagraph"/>
               <w:rPr>
+                <w:spacing w:val="-2"/>
+                <w:w w:val="105"/>
+                <w:sz w:val="15"/>
+              </w:rPr>
+            </w:pPr>
+            <w:r>
+              <w:rPr>
+                <w:spacing w:val="-2"/>
+                <w:w w:val="105"/>
+                <w:sz w:val="15"/>
+              </w:rPr>
+              <w:t xml:space="preserve">Agent:   </w:t>
+            </w:r>
+            <w:r>
+              <w:rPr>
+                <w:spacing w:val="-2"/>
+                <w:w w:val="105"/>
+                <w:sz w:val="15"/>
+                <w:u w:val="single"/>
+              </w:rPr>
+              <w:t xml:space="preserve">                                                                                   </w:t>
+            </w:r>
+            <w:r>
+              <w:rPr>
+                <w:spacing w:val="-2"/>
+                <w:w w:val="105"/>
+                <w:sz w:val="15"/>
+              </w:rPr>
+              <w:t xml:space="preserve"> </w:t>
+            </w:r>
+          </w:p>
+          <w:p>
+            <w:pPr>
+              <w:pStyle w:val="TableParagraph"/>
+              <w:rPr>
                 <w:rFonts w:ascii="Lucida Console" w:hAnsi="Lucida Console"/>
                 <w:sz w:val="15"/>
               </w:rPr>
             </w:pPr>
-            <w:r>
-              <w:rPr>
-                <w:spacing w:val="-2"/>
-                <w:w w:val="105"/>
-                <w:sz w:val="15"/>
-              </w:rPr>
-              <w:t xml:space="preserve">Agent:   </w:t>
-            </w:r>
-            <w:r>
-              <w:rPr>
-                <w:spacing w:val="-2"/>
-                <w:w w:val="105"/>
-                <w:sz w:val="15"/>
-                <w:u w:val="single"/>
-              </w:rPr>
-              <w:t xml:space="preserve">                                                                                   </w:t>
-            </w:r>
-            <w:r>
-              <w:rPr>
-                <w:spacing w:val="-2"/>
-                <w:w w:val="105"/>
-                <w:sz w:val="15"/>
-              </w:rPr>
-              <w:t xml:space="preserve"> </w:t>
-            </w:r>
           </w:p>
         </w:tc>
       </w:tr>
@@ -7011,6 +6966,12 @@
           <w:sz w:val="15"/>
         </w:rPr>
         <w:sectPr>
+          <w:headerReference w:type="even" r:id="rId12"/>
+          <w:headerReference w:type="default" r:id="rId13"/>
+          <w:footerReference w:type="even" r:id="rId14"/>
+          <w:footerReference w:type="default" r:id="rId15"/>
+          <w:headerReference w:type="first" r:id="rId16"/>
+          <w:footerReference w:type="first" r:id="rId17"/>
           <w:type w:val="continuous"/>
           <w:pgSz w:w="12240" w:h="15840"/>
           <w:pgMar w:top="300" w:right="720" w:bottom="280" w:left="720" w:header="720" w:footer="720" w:gutter="0"/>
@@ -9941,19 +9902,11 @@
         </w:rPr>
         <w:t xml:space="preserve"> </w:t>
       </w:r>
-      <w:proofErr w:type="gramStart"/>
-      <w:r>
-        <w:rPr>
-          <w:w w:val="105"/>
-        </w:rPr>
-        <w:t>higher</w:t>
-      </w:r>
-      <w:proofErr w:type="gramEnd"/>
-      <w:r>
-        <w:rPr>
-          <w:w w:val="105"/>
-        </w:rPr>
-        <w:t xml:space="preserve"> than that</w:t>
+      <w:r>
+        <w:rPr>
+          <w:w w:val="105"/>
+        </w:rPr>
+        <w:t>higher than that</w:t>
       </w:r>
       <w:r>
         <w:rPr>
@@ -10520,7 +10473,6 @@
         </w:rPr>
         <w:t xml:space="preserve"> </w:t>
       </w:r>
-      <w:proofErr w:type="gramStart"/>
       <w:r>
         <w:rPr>
           <w:w w:val="105"/>
@@ -10564,14 +10516,7 @@
         <w:rPr>
           <w:w w:val="105"/>
         </w:rPr>
-        <w:t>of</w:t>
-      </w:r>
-      <w:proofErr w:type="gramEnd"/>
-      <w:r>
-        <w:rPr>
-          <w:w w:val="105"/>
-        </w:rPr>
-        <w:t xml:space="preserve"> such declared value. In any event, the compensation shall not exceed the actual commercial</w:t>
+        <w:t>of such declared value. In any event, the compensation shall not exceed the actual commercial</w:t>
       </w:r>
       <w:r>
         <w:rPr>
@@ -12985,17 +12930,8 @@
           <w:w w:val="105"/>
           <w:sz w:val="8"/>
         </w:rPr>
-        <w:t xml:space="preserve">subcontractors, time </w:t>
-      </w:r>
-      <w:proofErr w:type="gramStart"/>
-      <w:r>
-        <w:rPr>
-          <w:w w:val="105"/>
-          <w:sz w:val="8"/>
-        </w:rPr>
-        <w:t>actually lost</w:t>
-      </w:r>
-      <w:proofErr w:type="gramEnd"/>
+        <w:t>subcontractors, time actually lost</w:t>
+      </w:r>
       <w:r>
         <w:rPr>
           <w:spacing w:val="21"/>
@@ -13252,23 +13188,7 @@
           <w:w w:val="105"/>
           <w:sz w:val="8"/>
         </w:rPr>
-        <w:t xml:space="preserve">The Master or the Carrier shall notify the Merchant or their agents and the </w:t>
-      </w:r>
-      <w:proofErr w:type="gramStart"/>
-      <w:r>
-        <w:rPr>
-          <w:w w:val="105"/>
-          <w:sz w:val="8"/>
-        </w:rPr>
-        <w:t>stevedores</w:t>
-      </w:r>
-      <w:proofErr w:type="gramEnd"/>
-      <w:r>
-        <w:rPr>
-          <w:w w:val="105"/>
-          <w:sz w:val="8"/>
-        </w:rPr>
-        <w:t xml:space="preserve"> of any</w:t>
+        <w:t>The Master or the Carrier shall notify the Merchant or their agents and the stevedores of any</w:t>
       </w:r>
       <w:r>
         <w:rPr>
@@ -13283,23 +13203,7 @@
           <w:w w:val="105"/>
           <w:sz w:val="8"/>
         </w:rPr>
-        <w:t xml:space="preserve">damage as soon </w:t>
-      </w:r>
-      <w:proofErr w:type="gramStart"/>
-      <w:r>
-        <w:rPr>
-          <w:w w:val="105"/>
-          <w:sz w:val="8"/>
-        </w:rPr>
-        <w:t>as reasonably</w:t>
-      </w:r>
-      <w:proofErr w:type="gramEnd"/>
-      <w:r>
-        <w:rPr>
-          <w:w w:val="105"/>
-          <w:sz w:val="8"/>
-        </w:rPr>
-        <w:t xml:space="preserve"> possible, failing which the Merchant</w:t>
+        <w:t>damage as soon as reasonably possible, failing which the Merchant</w:t>
       </w:r>
       <w:r>
         <w:rPr>
@@ -14035,7 +13939,6 @@
         </w:rPr>
         <w:t xml:space="preserve"> </w:t>
       </w:r>
-      <w:proofErr w:type="gramStart"/>
       <w:r>
         <w:rPr>
           <w:w w:val="105"/>
@@ -14043,7 +13946,6 @@
         </w:rPr>
         <w:t>his</w:t>
       </w:r>
-      <w:proofErr w:type="gramEnd"/>
       <w:r>
         <w:rPr>
           <w:spacing w:val="15"/>
@@ -15020,19 +14922,11 @@
         <w:spacing w:line="295" w:lineRule="auto"/>
         <w:ind w:right="1"/>
       </w:pPr>
-      <w:proofErr w:type="gramStart"/>
-      <w:r>
-        <w:rPr>
-          <w:w w:val="105"/>
-        </w:rPr>
-        <w:t>(d) If</w:t>
-      </w:r>
-      <w:proofErr w:type="gramEnd"/>
-      <w:r>
-        <w:rPr>
-          <w:w w:val="105"/>
-        </w:rPr>
-        <w:t xml:space="preserve"> the loading/discharging berth is not available on the Vessel's arrival at or off the port of</w:t>
+      <w:r>
+        <w:rPr>
+          <w:w w:val="105"/>
+        </w:rPr>
+        <w:t>(d) If the loading/discharging berth is not available on the Vessel's arrival at or off the port of</w:t>
       </w:r>
       <w:r>
         <w:rPr>
@@ -15666,19 +15560,11 @@
         </w:rPr>
         <w:t xml:space="preserve"> </w:t>
       </w:r>
-      <w:proofErr w:type="gramStart"/>
-      <w:r>
-        <w:rPr>
-          <w:w w:val="105"/>
-        </w:rPr>
-        <w:t>rata</w:t>
-      </w:r>
-      <w:proofErr w:type="gramEnd"/>
-      <w:r>
-        <w:rPr>
-          <w:w w:val="105"/>
-        </w:rPr>
-        <w:t xml:space="preserve"> for</w:t>
+      <w:r>
+        <w:rPr>
+          <w:w w:val="105"/>
+        </w:rPr>
+        <w:t>rata for</w:t>
       </w:r>
       <w:r>
         <w:rPr>
@@ -16203,37 +16089,12 @@
         </w:rPr>
         <w:t xml:space="preserve"> </w:t>
       </w:r>
-      <w:proofErr w:type="gramStart"/>
-      <w:r>
-        <w:rPr>
-          <w:w w:val="105"/>
-          <w:sz w:val="8"/>
-        </w:rPr>
-        <w:t>Carrier</w:t>
-      </w:r>
-      <w:proofErr w:type="gramEnd"/>
-      <w:r>
-        <w:rPr>
-          <w:w w:val="105"/>
-          <w:sz w:val="8"/>
-        </w:rPr>
-        <w:t xml:space="preserve"> its agents, successors, or assignee, of </w:t>
-      </w:r>
-      <w:proofErr w:type="gramStart"/>
-      <w:r>
-        <w:rPr>
-          <w:w w:val="105"/>
-          <w:sz w:val="8"/>
-        </w:rPr>
-        <w:t>a compensation</w:t>
-      </w:r>
-      <w:proofErr w:type="gramEnd"/>
-      <w:r>
-        <w:rPr>
-          <w:w w:val="105"/>
-          <w:sz w:val="8"/>
-        </w:rPr>
-        <w:t xml:space="preserve"> equal to the value of the Freight,</w:t>
+      <w:r>
+        <w:rPr>
+          <w:w w:val="105"/>
+          <w:sz w:val="8"/>
+        </w:rPr>
+        <w:t>Carrier its agents, successors, or assignee, of a compensation equal to the value of the Freight,</w:t>
       </w:r>
       <w:r>
         <w:rPr>
@@ -16461,23 +16322,7 @@
           <w:w w:val="105"/>
           <w:sz w:val="8"/>
         </w:rPr>
-        <w:t xml:space="preserve">causes, and any extra handling of the Cargo for any of the </w:t>
-      </w:r>
-      <w:proofErr w:type="gramStart"/>
-      <w:r>
-        <w:rPr>
-          <w:w w:val="105"/>
-          <w:sz w:val="8"/>
-        </w:rPr>
-        <w:t>aforementioned reasons</w:t>
-      </w:r>
-      <w:proofErr w:type="gramEnd"/>
-      <w:r>
-        <w:rPr>
-          <w:w w:val="105"/>
-          <w:sz w:val="8"/>
-        </w:rPr>
-        <w:t>.</w:t>
+        <w:t>causes, and any extra handling of the Cargo for any of the aforementioned reasons.</w:t>
       </w:r>
     </w:p>
     <w:p>
@@ -16516,23 +16361,7 @@
           <w:w w:val="105"/>
           <w:sz w:val="8"/>
         </w:rPr>
-        <w:t xml:space="preserve">denomination may be levied, inter alia, </w:t>
-      </w:r>
-      <w:proofErr w:type="gramStart"/>
-      <w:r>
-        <w:rPr>
-          <w:w w:val="105"/>
-          <w:sz w:val="8"/>
-        </w:rPr>
-        <w:t>on the basis of</w:t>
-      </w:r>
-      <w:proofErr w:type="gramEnd"/>
-      <w:r>
-        <w:rPr>
-          <w:w w:val="105"/>
-          <w:sz w:val="8"/>
-        </w:rPr>
-        <w:t xml:space="preserve"> freight, weight of Cargo or tonnage of the</w:t>
+        <w:t>denomination may be levied, inter alia, on the basis of freight, weight of Cargo or tonnage of the</w:t>
       </w:r>
       <w:r>
         <w:rPr>
@@ -16687,39 +16516,7 @@
           <w:w w:val="105"/>
           <w:sz w:val="8"/>
         </w:rPr>
-        <w:t xml:space="preserve">declaration had been correctly given. </w:t>
-      </w:r>
-      <w:proofErr w:type="gramStart"/>
-      <w:r>
-        <w:rPr>
-          <w:w w:val="105"/>
-          <w:sz w:val="8"/>
-        </w:rPr>
-        <w:t>For the purpose of</w:t>
-      </w:r>
-      <w:proofErr w:type="gramEnd"/>
-      <w:r>
-        <w:rPr>
-          <w:w w:val="105"/>
-          <w:sz w:val="8"/>
-        </w:rPr>
-        <w:t xml:space="preserve"> ascertaining the </w:t>
-      </w:r>
-      <w:proofErr w:type="gramStart"/>
-      <w:r>
-        <w:rPr>
-          <w:w w:val="105"/>
-          <w:sz w:val="8"/>
-        </w:rPr>
-        <w:t>actual facts</w:t>
-      </w:r>
-      <w:proofErr w:type="gramEnd"/>
-      <w:r>
-        <w:rPr>
-          <w:w w:val="105"/>
-          <w:sz w:val="8"/>
-        </w:rPr>
-        <w:t>, the Carrier</w:t>
+        <w:t>declaration had been correctly given. For the purpose of ascertaining the actual facts, the Carrier</w:t>
       </w:r>
       <w:r>
         <w:rPr>
@@ -18292,7 +18089,6 @@
         </w:rPr>
         <w:t xml:space="preserve"> </w:t>
       </w:r>
-      <w:proofErr w:type="gramStart"/>
       <w:r>
         <w:rPr>
           <w:w w:val="105"/>
@@ -18315,7 +18111,6 @@
         </w:rPr>
         <w:t>and</w:t>
       </w:r>
-      <w:proofErr w:type="gramEnd"/>
       <w:r>
         <w:rPr>
           <w:spacing w:val="40"/>
@@ -21391,7 +21186,6 @@
         </w:rPr>
         <w:t xml:space="preserve"> </w:t>
       </w:r>
-      <w:proofErr w:type="gramStart"/>
       <w:r>
         <w:rPr>
           <w:w w:val="105"/>
@@ -21414,7 +21208,6 @@
         </w:rPr>
         <w:t>or</w:t>
       </w:r>
-      <w:proofErr w:type="gramEnd"/>
       <w:r>
         <w:rPr>
           <w:spacing w:val="25"/>
@@ -21722,23 +21515,7 @@
           <w:w w:val="105"/>
           <w:sz w:val="8"/>
         </w:rPr>
-        <w:t xml:space="preserve">onboard to risk of seizure, damage or delay, in consequence of war, warlike operations, </w:t>
-      </w:r>
-      <w:proofErr w:type="gramStart"/>
-      <w:r>
-        <w:rPr>
-          <w:w w:val="105"/>
-          <w:sz w:val="8"/>
-        </w:rPr>
-        <w:t>blockade</w:t>
-      </w:r>
-      <w:proofErr w:type="gramEnd"/>
-      <w:r>
-        <w:rPr>
-          <w:w w:val="105"/>
-          <w:sz w:val="8"/>
-        </w:rPr>
-        <w:t>,</w:t>
+        <w:t>onboard to risk of seizure, damage or delay, in consequence of war, warlike operations, blockade,</w:t>
       </w:r>
       <w:r>
         <w:rPr>
@@ -21777,14 +21554,12 @@
         <w:spacing w:line="295" w:lineRule="auto"/>
         <w:ind w:right="84"/>
       </w:pPr>
-      <w:proofErr w:type="gramStart"/>
       <w:r>
         <w:rPr>
           <w:w w:val="105"/>
         </w:rPr>
         <w:t>commotions</w:t>
       </w:r>
-      <w:proofErr w:type="gramEnd"/>
       <w:r>
         <w:rPr>
           <w:spacing w:val="9"/>
@@ -24423,7 +24198,6 @@
           <w:sz w:val="8"/>
         </w:rPr>
       </w:pPr>
-      <w:proofErr w:type="gramStart"/>
       <w:r>
         <w:rPr>
           <w:w w:val="105"/>
@@ -24476,7 +24250,6 @@
         </w:rPr>
         <w:t>of</w:t>
       </w:r>
-      <w:proofErr w:type="gramEnd"/>
       <w:r>
         <w:rPr>
           <w:spacing w:val="10"/>
@@ -24775,9 +24548,121 @@
           <w:w w:val="105"/>
           <w:sz w:val="8"/>
         </w:rPr>
-        <w:t xml:space="preserve">the benefit of all </w:t>
-      </w:r>
-      <w:proofErr w:type="gramStart"/>
+        <w:t>the benefit of all persons mentioned</w:t>
+      </w:r>
+      <w:r>
+        <w:rPr>
+          <w:spacing w:val="12"/>
+          <w:w w:val="105"/>
+          <w:sz w:val="8"/>
+        </w:rPr>
+        <w:t xml:space="preserve"> </w:t>
+      </w:r>
+      <w:r>
+        <w:rPr>
+          <w:w w:val="105"/>
+          <w:sz w:val="8"/>
+        </w:rPr>
+        <w:t>in sub-</w:t>
+      </w:r>
+      <w:r>
+        <w:rPr>
+          <w:spacing w:val="40"/>
+          <w:w w:val="105"/>
+          <w:sz w:val="8"/>
+        </w:rPr>
+        <w:t xml:space="preserve"> </w:t>
+      </w:r>
+      <w:r>
+        <w:rPr>
+          <w:w w:val="105"/>
+          <w:sz w:val="8"/>
+        </w:rPr>
+        <w:t>clause (a)</w:t>
+      </w:r>
+      <w:r>
+        <w:rPr>
+          <w:spacing w:val="7"/>
+          <w:w w:val="105"/>
+          <w:sz w:val="8"/>
+        </w:rPr>
+        <w:t xml:space="preserve"> </w:t>
+      </w:r>
+      <w:r>
+        <w:rPr>
+          <w:w w:val="105"/>
+          <w:sz w:val="8"/>
+        </w:rPr>
+        <w:t>above who</w:t>
+      </w:r>
+      <w:r>
+        <w:rPr>
+          <w:spacing w:val="7"/>
+          <w:w w:val="105"/>
+          <w:sz w:val="8"/>
+        </w:rPr>
+        <w:t xml:space="preserve"> </w:t>
+      </w:r>
+      <w:r>
+        <w:rPr>
+          <w:w w:val="105"/>
+          <w:sz w:val="8"/>
+        </w:rPr>
+        <w:t>are its</w:t>
+      </w:r>
+      <w:r>
+        <w:rPr>
+          <w:spacing w:val="9"/>
+          <w:w w:val="105"/>
+          <w:sz w:val="8"/>
+        </w:rPr>
+        <w:t xml:space="preserve"> </w:t>
+      </w:r>
+      <w:r>
+        <w:rPr>
+          <w:w w:val="105"/>
+          <w:sz w:val="8"/>
+        </w:rPr>
+        <w:t>Servant</w:t>
+      </w:r>
+      <w:r>
+        <w:rPr>
+          <w:spacing w:val="5"/>
+          <w:w w:val="105"/>
+          <w:sz w:val="8"/>
+        </w:rPr>
+        <w:t xml:space="preserve"> </w:t>
+      </w:r>
+      <w:r>
+        <w:rPr>
+          <w:w w:val="105"/>
+          <w:sz w:val="8"/>
+        </w:rPr>
+        <w:t>and</w:t>
+      </w:r>
+      <w:r>
+        <w:rPr>
+          <w:spacing w:val="7"/>
+          <w:w w:val="105"/>
+          <w:sz w:val="8"/>
+        </w:rPr>
+        <w:t xml:space="preserve"> </w:t>
+      </w:r>
+      <w:r>
+        <w:rPr>
+          <w:w w:val="105"/>
+          <w:sz w:val="8"/>
+        </w:rPr>
+        <w:t>all such</w:t>
+      </w:r>
+      <w:r>
+        <w:rPr>
+          <w:spacing w:val="7"/>
+          <w:w w:val="105"/>
+          <w:sz w:val="8"/>
+        </w:rPr>
+        <w:t xml:space="preserve"> </w:t>
+      </w:r>
       <w:r>
         <w:rPr>
           <w:w w:val="105"/>
@@ -24785,138 +24670,6 @@
         </w:rPr>
         <w:t>persons</w:t>
       </w:r>
-      <w:proofErr w:type="gramEnd"/>
-      <w:r>
-        <w:rPr>
-          <w:w w:val="105"/>
-          <w:sz w:val="8"/>
-        </w:rPr>
-        <w:t xml:space="preserve"> mentioned</w:t>
-      </w:r>
-      <w:r>
-        <w:rPr>
-          <w:spacing w:val="12"/>
-          <w:w w:val="105"/>
-          <w:sz w:val="8"/>
-        </w:rPr>
-        <w:t xml:space="preserve"> </w:t>
-      </w:r>
-      <w:r>
-        <w:rPr>
-          <w:w w:val="105"/>
-          <w:sz w:val="8"/>
-        </w:rPr>
-        <w:t>in sub-</w:t>
-      </w:r>
-      <w:r>
-        <w:rPr>
-          <w:spacing w:val="40"/>
-          <w:w w:val="105"/>
-          <w:sz w:val="8"/>
-        </w:rPr>
-        <w:t xml:space="preserve"> </w:t>
-      </w:r>
-      <w:r>
-        <w:rPr>
-          <w:w w:val="105"/>
-          <w:sz w:val="8"/>
-        </w:rPr>
-        <w:t>clause (a)</w:t>
-      </w:r>
-      <w:r>
-        <w:rPr>
-          <w:spacing w:val="7"/>
-          <w:w w:val="105"/>
-          <w:sz w:val="8"/>
-        </w:rPr>
-        <w:t xml:space="preserve"> </w:t>
-      </w:r>
-      <w:r>
-        <w:rPr>
-          <w:w w:val="105"/>
-          <w:sz w:val="8"/>
-        </w:rPr>
-        <w:t>above who</w:t>
-      </w:r>
-      <w:r>
-        <w:rPr>
-          <w:spacing w:val="7"/>
-          <w:w w:val="105"/>
-          <w:sz w:val="8"/>
-        </w:rPr>
-        <w:t xml:space="preserve"> </w:t>
-      </w:r>
-      <w:r>
-        <w:rPr>
-          <w:w w:val="105"/>
-          <w:sz w:val="8"/>
-        </w:rPr>
-        <w:t>are its</w:t>
-      </w:r>
-      <w:r>
-        <w:rPr>
-          <w:spacing w:val="9"/>
-          <w:w w:val="105"/>
-          <w:sz w:val="8"/>
-        </w:rPr>
-        <w:t xml:space="preserve"> </w:t>
-      </w:r>
-      <w:proofErr w:type="gramStart"/>
-      <w:r>
-        <w:rPr>
-          <w:w w:val="105"/>
-          <w:sz w:val="8"/>
-        </w:rPr>
-        <w:t>Servant</w:t>
-      </w:r>
-      <w:proofErr w:type="gramEnd"/>
-      <w:r>
-        <w:rPr>
-          <w:spacing w:val="5"/>
-          <w:w w:val="105"/>
-          <w:sz w:val="8"/>
-        </w:rPr>
-        <w:t xml:space="preserve"> </w:t>
-      </w:r>
-      <w:r>
-        <w:rPr>
-          <w:w w:val="105"/>
-          <w:sz w:val="8"/>
-        </w:rPr>
-        <w:t>and</w:t>
-      </w:r>
-      <w:r>
-        <w:rPr>
-          <w:spacing w:val="7"/>
-          <w:w w:val="105"/>
-          <w:sz w:val="8"/>
-        </w:rPr>
-        <w:t xml:space="preserve"> </w:t>
-      </w:r>
-      <w:r>
-        <w:rPr>
-          <w:w w:val="105"/>
-          <w:sz w:val="8"/>
-        </w:rPr>
-        <w:t>all such</w:t>
-      </w:r>
-      <w:r>
-        <w:rPr>
-          <w:spacing w:val="7"/>
-          <w:w w:val="105"/>
-          <w:sz w:val="8"/>
-        </w:rPr>
-        <w:t xml:space="preserve"> </w:t>
-      </w:r>
-      <w:proofErr w:type="gramStart"/>
-      <w:r>
-        <w:rPr>
-          <w:w w:val="105"/>
-          <w:sz w:val="8"/>
-        </w:rPr>
-        <w:t>persons</w:t>
-      </w:r>
-      <w:proofErr w:type="gramEnd"/>
       <w:r>
         <w:rPr>
           <w:spacing w:val="5"/>
@@ -25363,7 +25116,6 @@
         <w:t>i</w:t>
       </w:r>
       <w:proofErr w:type="spellEnd"/>
-      <w:proofErr w:type="gramStart"/>
       <w:r>
         <w:rPr>
           <w:sz w:val="6"/>
@@ -25380,7 +25132,6 @@
       <w:r>
         <w:t>n</w:t>
       </w:r>
-      <w:proofErr w:type="gramEnd"/>
       <w:r>
         <w:rPr>
           <w:spacing w:val="14"/>
@@ -26812,16 +26563,8 @@
         <w:rPr>
           <w:w w:val="105"/>
         </w:rPr>
-        <w:t xml:space="preserve">The Merchant shall be liable to the Carrier for any loss, damage to, or delay, including </w:t>
-      </w:r>
-      <w:proofErr w:type="gramStart"/>
-      <w:r>
-        <w:rPr>
-          <w:w w:val="105"/>
-        </w:rPr>
-        <w:t>demurrage</w:t>
-      </w:r>
-      <w:proofErr w:type="gramEnd"/>
+        <w:t>The Merchant shall be liable to the Carrier for any loss, damage to, or delay, including demurrage</w:t>
+      </w:r>
       <w:r>
         <w:rPr>
           <w:spacing w:val="40"/>
@@ -27362,15 +27105,7 @@
           <w:w w:val="105"/>
           <w:sz w:val="8"/>
         </w:rPr>
-        <w:t xml:space="preserve">ANEMOS </w:t>
-      </w:r>
-      <w:proofErr w:type="gramStart"/>
-      <w:r>
-        <w:rPr>
-          <w:w w:val="105"/>
-          <w:sz w:val="8"/>
-        </w:rPr>
-        <w:t>is</w:t>
+        <w:t>ANEMOS is</w:t>
       </w:r>
       <w:r>
         <w:rPr>
@@ -27387,7 +27122,6 @@
         </w:rPr>
         <w:t>materialized</w:t>
       </w:r>
-      <w:proofErr w:type="gramEnd"/>
       <w:r>
         <w:rPr>
           <w:spacing w:val="5"/>
@@ -28636,6 +28370,209 @@
     </w:sectPr>
   </w:body>
 </w:document>
+</file>
+
+<file path=word/endnotes.xml><?xml version="1.0" encoding="utf-8"?>
+<w:endnotes xmlns:wpc="http://schemas.microsoft.com/office/word/2010/wordprocessingCanvas" xmlns:cx="http://schemas.microsoft.com/office/drawing/2014/chartex" xmlns:cx1="http://schemas.microsoft.com/office/drawing/2015/9/8/chartex" xmlns:cx2="http://schemas.microsoft.com/office/drawing/2015/10/21/chartex" xmlns:cx3="http://schemas.microsoft.com/office/drawing/2016/5/9/chartex" xmlns:cx4="http://schemas.microsoft.com/office/drawing/2016/5/10/chartex" xmlns:cx5="http://schemas.microsoft.com/office/drawing/2016/5/11/chartex" xmlns:cx6="http://schemas.microsoft.com/office/drawing/2016/5/12/chartex" xmlns:cx7="http://schemas.microsoft.com/office/drawing/2016/5/13/chartex" xmlns:cx8="http://schemas.microsoft.com/office/drawing/2016/5/14/chartex" xmlns:mc="http://schemas.openxmlformats.org/markup-compatibility/2006" xmlns:aink="http://schemas.microsoft.com/office/drawing/2016/ink" xmlns:am3d="http://schemas.microsoft.com/office/drawing/2017/model3d" xmlns:o="urn:schemas-microsoft-com:office:office" xmlns:oel="http://schemas.microsoft.com/office/2019/extlst" xmlns:r="http://schemas.openxmlformats.org/officeDocument/2006/relationships" xmlns:m="http://schemas.openxmlformats.org/officeDocument/2006/math" xmlns:v="urn:schemas-microsoft-com:vml" xmlns:wp14="http://schemas.microsoft.com/office/word/2010/wordprocessingDrawing" xmlns:wp="http://schemas.openxmlformats.org/drawingml/2006/wordprocessingDrawing" xmlns:w10="urn:schemas-microsoft-com:office:word" xmlns:w="http://schemas.openxmlformats.org/wordprocessingml/2006/main" xmlns:w14="http://schemas.microsoft.com/office/word/2010/wordml" xmlns:w15="http://schemas.microsoft.com/office/word/2012/wordml" xmlns:w16cex="http://schemas.microsoft.com/office/word/2018/wordml/cex" xmlns:w16cid="http://schemas.microsoft.com/office/word/2016/wordml/cid" xmlns:w16="http://schemas.microsoft.com/office/word/2018/wordml" xmlns:w16du="http://schemas.microsoft.com/office/word/2023/wordml/word16du" xmlns:w16sdtdh="http://schemas.microsoft.com/office/word/2020/wordml/sdtdatahash" xmlns:w16sdtfl="http://schemas.microsoft.com/office/word/2024/wordml/sdtformatlock" xmlns:w16se="http://schemas.microsoft.com/office/word/2015/wordml/symex" xmlns:wpg="http://schemas.microsoft.com/office/word/2010/wordprocessingGroup" xmlns:wpi="http://schemas.microsoft.com/office/word/2010/wordprocessingInk" xmlns:wne="http://schemas.microsoft.com/office/word/2006/wordml" xmlns:wps="http://schemas.microsoft.com/office/word/2010/wordprocessingShape" mc:Ignorable="w14 w15 w16se w16cid w16 w16cex w16sdtdh w16sdtfl w16du wp14">
+  <w:endnote w:type="separator" w:id="-1">
+    <w:p>
+      <w:r>
+        <w:separator/>
+      </w:r>
+    </w:p>
+  </w:endnote>
+  <w:endnote w:type="continuationSeparator" w:id="0">
+    <w:p>
+      <w:r>
+        <w:continuationSeparator/>
+      </w:r>
+    </w:p>
+  </w:endnote>
+</w:endnotes>
+</file>
+
+<file path=word/footer1.xml><?xml version="1.0" encoding="utf-8"?>
+<w:ftr xmlns:wpc="http://schemas.microsoft.com/office/word/2010/wordprocessingCanvas" xmlns:cx="http://schemas.microsoft.com/office/drawing/2014/chartex" xmlns:cx1="http://schemas.microsoft.com/office/drawing/2015/9/8/chartex" xmlns:cx2="http://schemas.microsoft.com/office/drawing/2015/10/21/chartex" xmlns:cx3="http://schemas.microsoft.com/office/drawing/2016/5/9/chartex" xmlns:cx4="http://schemas.microsoft.com/office/drawing/2016/5/10/chartex" xmlns:cx5="http://schemas.microsoft.com/office/drawing/2016/5/11/chartex" xmlns:cx6="http://schemas.microsoft.com/office/drawing/2016/5/12/chartex" xmlns:cx7="http://schemas.microsoft.com/office/drawing/2016/5/13/chartex" xmlns:cx8="http://schemas.microsoft.com/office/drawing/2016/5/14/chartex" xmlns:mc="http://schemas.openxmlformats.org/markup-compatibility/2006" xmlns:aink="http://schemas.microsoft.com/office/drawing/2016/ink" xmlns:am3d="http://schemas.microsoft.com/office/drawing/2017/model3d" xmlns:o="urn:schemas-microsoft-com:office:office" xmlns:oel="http://schemas.microsoft.com/office/2019/extlst" xmlns:r="http://schemas.openxmlformats.org/officeDocument/2006/relationships" xmlns:m="http://schemas.openxmlformats.org/officeDocument/2006/math" xmlns:v="urn:schemas-microsoft-com:vml" xmlns:wp14="http://schemas.microsoft.com/office/word/2010/wordprocessingDrawing" xmlns:wp="http://schemas.openxmlformats.org/drawingml/2006/wordprocessingDrawing" xmlns:w10="urn:schemas-microsoft-com:office:word" xmlns:w="http://schemas.openxmlformats.org/wordprocessingml/2006/main" xmlns:w14="http://schemas.microsoft.com/office/word/2010/wordml" xmlns:w15="http://schemas.microsoft.com/office/word/2012/wordml" xmlns:w16cex="http://schemas.microsoft.com/office/word/2018/wordml/cex" xmlns:w16cid="http://schemas.microsoft.com/office/word/2016/wordml/cid" xmlns:w16="http://schemas.microsoft.com/office/word/2018/wordml" xmlns:w16du="http://schemas.microsoft.com/office/word/2023/wordml/word16du" xmlns:w16sdtdh="http://schemas.microsoft.com/office/word/2020/wordml/sdtdatahash" xmlns:w16sdtfl="http://schemas.microsoft.com/office/word/2024/wordml/sdtformatlock" xmlns:w16se="http://schemas.microsoft.com/office/word/2015/wordml/symex" xmlns:wpg="http://schemas.microsoft.com/office/word/2010/wordprocessingGroup" xmlns:wpi="http://schemas.microsoft.com/office/word/2010/wordprocessingInk" xmlns:wne="http://schemas.microsoft.com/office/word/2006/wordml" xmlns:wps="http://schemas.microsoft.com/office/word/2010/wordprocessingShape" mc:Ignorable="w14 w15 w16se w16cid w16 w16cex w16sdtdh w16sdtfl w16du wp14">
+  <w:p>
+    <w:pPr>
+      <w:pStyle w:val="Pieddepage"/>
+    </w:pPr>
+  </w:p>
+</w:ftr>
+</file>
+
+<file path=word/footer2.xml><?xml version="1.0" encoding="utf-8"?>
+<w:ftr xmlns:wpc="http://schemas.microsoft.com/office/word/2010/wordprocessingCanvas" xmlns:cx="http://schemas.microsoft.com/office/drawing/2014/chartex" xmlns:cx1="http://schemas.microsoft.com/office/drawing/2015/9/8/chartex" xmlns:cx2="http://schemas.microsoft.com/office/drawing/2015/10/21/chartex" xmlns:cx3="http://schemas.microsoft.com/office/drawing/2016/5/9/chartex" xmlns:cx4="http://schemas.microsoft.com/office/drawing/2016/5/10/chartex" xmlns:cx5="http://schemas.microsoft.com/office/drawing/2016/5/11/chartex" xmlns:cx6="http://schemas.microsoft.com/office/drawing/2016/5/12/chartex" xmlns:cx7="http://schemas.microsoft.com/office/drawing/2016/5/13/chartex" xmlns:cx8="http://schemas.microsoft.com/office/drawing/2016/5/14/chartex" xmlns:mc="http://schemas.openxmlformats.org/markup-compatibility/2006" xmlns:aink="http://schemas.microsoft.com/office/drawing/2016/ink" xmlns:am3d="http://schemas.microsoft.com/office/drawing/2017/model3d" xmlns:o="urn:schemas-microsoft-com:office:office" xmlns:oel="http://schemas.microsoft.com/office/2019/extlst" xmlns:r="http://schemas.openxmlformats.org/officeDocument/2006/relationships" xmlns:m="http://schemas.openxmlformats.org/officeDocument/2006/math" xmlns:v="urn:schemas-microsoft-com:vml" xmlns:wp14="http://schemas.microsoft.com/office/word/2010/wordprocessingDrawing" xmlns:wp="http://schemas.openxmlformats.org/drawingml/2006/wordprocessingDrawing" xmlns:w10="urn:schemas-microsoft-com:office:word" xmlns:w="http://schemas.openxmlformats.org/wordprocessingml/2006/main" xmlns:w14="http://schemas.microsoft.com/office/word/2010/wordml" xmlns:w15="http://schemas.microsoft.com/office/word/2012/wordml" xmlns:w16cex="http://schemas.microsoft.com/office/word/2018/wordml/cex" xmlns:w16cid="http://schemas.microsoft.com/office/word/2016/wordml/cid" xmlns:w16="http://schemas.microsoft.com/office/word/2018/wordml" xmlns:w16du="http://schemas.microsoft.com/office/word/2023/wordml/word16du" xmlns:w16sdtdh="http://schemas.microsoft.com/office/word/2020/wordml/sdtdatahash" xmlns:w16sdtfl="http://schemas.microsoft.com/office/word/2024/wordml/sdtformatlock" xmlns:w16se="http://schemas.microsoft.com/office/word/2015/wordml/symex" xmlns:wpg="http://schemas.microsoft.com/office/word/2010/wordprocessingGroup" xmlns:wpi="http://schemas.microsoft.com/office/word/2010/wordprocessingInk" xmlns:wne="http://schemas.microsoft.com/office/word/2006/wordml" xmlns:wps="http://schemas.microsoft.com/office/word/2010/wordprocessingShape" mc:Ignorable="w14 w15 w16se w16cid w16 w16cex w16sdtdh w16sdtfl w16du wp14">
+  <w:p>
+    <w:pPr>
+      <w:pStyle w:val="Pieddepage"/>
+    </w:pPr>
+  </w:p>
+</w:ftr>
+</file>
+
+<file path=word/footer3.xml><?xml version="1.0" encoding="utf-8"?>
+<w:ftr xmlns:wpc="http://schemas.microsoft.com/office/word/2010/wordprocessingCanvas" xmlns:cx="http://schemas.microsoft.com/office/drawing/2014/chartex" xmlns:cx1="http://schemas.microsoft.com/office/drawing/2015/9/8/chartex" xmlns:cx2="http://schemas.microsoft.com/office/drawing/2015/10/21/chartex" xmlns:cx3="http://schemas.microsoft.com/office/drawing/2016/5/9/chartex" xmlns:cx4="http://schemas.microsoft.com/office/drawing/2016/5/10/chartex" xmlns:cx5="http://schemas.microsoft.com/office/drawing/2016/5/11/chartex" xmlns:cx6="http://schemas.microsoft.com/office/drawing/2016/5/12/chartex" xmlns:cx7="http://schemas.microsoft.com/office/drawing/2016/5/13/chartex" xmlns:cx8="http://schemas.microsoft.com/office/drawing/2016/5/14/chartex" xmlns:mc="http://schemas.openxmlformats.org/markup-compatibility/2006" xmlns:aink="http://schemas.microsoft.com/office/drawing/2016/ink" xmlns:am3d="http://schemas.microsoft.com/office/drawing/2017/model3d" xmlns:o="urn:schemas-microsoft-com:office:office" xmlns:oel="http://schemas.microsoft.com/office/2019/extlst" xmlns:r="http://schemas.openxmlformats.org/officeDocument/2006/relationships" xmlns:m="http://schemas.openxmlformats.org/officeDocument/2006/math" xmlns:v="urn:schemas-microsoft-com:vml" xmlns:wp14="http://schemas.microsoft.com/office/word/2010/wordprocessingDrawing" xmlns:wp="http://schemas.openxmlformats.org/drawingml/2006/wordprocessingDrawing" xmlns:w10="urn:schemas-microsoft-com:office:word" xmlns:w="http://schemas.openxmlformats.org/wordprocessingml/2006/main" xmlns:w14="http://schemas.microsoft.com/office/word/2010/wordml" xmlns:w15="http://schemas.microsoft.com/office/word/2012/wordml" xmlns:w16cex="http://schemas.microsoft.com/office/word/2018/wordml/cex" xmlns:w16cid="http://schemas.microsoft.com/office/word/2016/wordml/cid" xmlns:w16="http://schemas.microsoft.com/office/word/2018/wordml" xmlns:w16du="http://schemas.microsoft.com/office/word/2023/wordml/word16du" xmlns:w16sdtdh="http://schemas.microsoft.com/office/word/2020/wordml/sdtdatahash" xmlns:w16sdtfl="http://schemas.microsoft.com/office/word/2024/wordml/sdtformatlock" xmlns:w16se="http://schemas.microsoft.com/office/word/2015/wordml/symex" xmlns:wpg="http://schemas.microsoft.com/office/word/2010/wordprocessingGroup" xmlns:wpi="http://schemas.microsoft.com/office/word/2010/wordprocessingInk" xmlns:wne="http://schemas.microsoft.com/office/word/2006/wordml" xmlns:wps="http://schemas.microsoft.com/office/word/2010/wordprocessingShape" mc:Ignorable="w14 w15 w16se w16cid w16 w16cex w16sdtdh w16sdtfl w16du wp14">
+  <w:p>
+    <w:pPr>
+      <w:pStyle w:val="Pieddepage"/>
+    </w:pPr>
+  </w:p>
+</w:ftr>
+</file>
+
+<file path=word/footnotes.xml><?xml version="1.0" encoding="utf-8"?>
+<w:footnotes xmlns:wpc="http://schemas.microsoft.com/office/word/2010/wordprocessingCanvas" xmlns:cx="http://schemas.microsoft.com/office/drawing/2014/chartex" xmlns:cx1="http://schemas.microsoft.com/office/drawing/2015/9/8/chartex" xmlns:cx2="http://schemas.microsoft.com/office/drawing/2015/10/21/chartex" xmlns:cx3="http://schemas.microsoft.com/office/drawing/2016/5/9/chartex" xmlns:cx4="http://schemas.microsoft.com/office/drawing/2016/5/10/chartex" xmlns:cx5="http://schemas.microsoft.com/office/drawing/2016/5/11/chartex" xmlns:cx6="http://schemas.microsoft.com/office/drawing/2016/5/12/chartex" xmlns:cx7="http://schemas.microsoft.com/office/drawing/2016/5/13/chartex" xmlns:cx8="http://schemas.microsoft.com/office/drawing/2016/5/14/chartex" xmlns:mc="http://schemas.openxmlformats.org/markup-compatibility/2006" xmlns:aink="http://schemas.microsoft.com/office/drawing/2016/ink" xmlns:am3d="http://schemas.microsoft.com/office/drawing/2017/model3d" xmlns:o="urn:schemas-microsoft-com:office:office" xmlns:oel="http://schemas.microsoft.com/office/2019/extlst" xmlns:r="http://schemas.openxmlformats.org/officeDocument/2006/relationships" xmlns:m="http://schemas.openxmlformats.org/officeDocument/2006/math" xmlns:v="urn:schemas-microsoft-com:vml" xmlns:wp14="http://schemas.microsoft.com/office/word/2010/wordprocessingDrawing" xmlns:wp="http://schemas.openxmlformats.org/drawingml/2006/wordprocessingDrawing" xmlns:w10="urn:schemas-microsoft-com:office:word" xmlns:w="http://schemas.openxmlformats.org/wordprocessingml/2006/main" xmlns:w14="http://schemas.microsoft.com/office/word/2010/wordml" xmlns:w15="http://schemas.microsoft.com/office/word/2012/wordml" xmlns:w16cex="http://schemas.microsoft.com/office/word/2018/wordml/cex" xmlns:w16cid="http://schemas.microsoft.com/office/word/2016/wordml/cid" xmlns:w16="http://schemas.microsoft.com/office/word/2018/wordml" xmlns:w16du="http://schemas.microsoft.com/office/word/2023/wordml/word16du" xmlns:w16sdtdh="http://schemas.microsoft.com/office/word/2020/wordml/sdtdatahash" xmlns:w16sdtfl="http://schemas.microsoft.com/office/word/2024/wordml/sdtformatlock" xmlns:w16se="http://schemas.microsoft.com/office/word/2015/wordml/symex" xmlns:wpg="http://schemas.microsoft.com/office/word/2010/wordprocessingGroup" xmlns:wpi="http://schemas.microsoft.com/office/word/2010/wordprocessingInk" xmlns:wne="http://schemas.microsoft.com/office/word/2006/wordml" xmlns:wps="http://schemas.microsoft.com/office/word/2010/wordprocessingShape" mc:Ignorable="w14 w15 w16se w16cid w16 w16cex w16sdtdh w16sdtfl w16du wp14">
+  <w:footnote w:type="separator" w:id="-1">
+    <w:p>
+      <w:r>
+        <w:separator/>
+      </w:r>
+    </w:p>
+  </w:footnote>
+  <w:footnote w:type="continuationSeparator" w:id="0">
+    <w:p>
+      <w:r>
+        <w:continuationSeparator/>
+      </w:r>
+    </w:p>
+  </w:footnote>
+</w:footnotes>
+</file>
+
+<file path=word/header1.xml><?xml version="1.0" encoding="utf-8"?>
+<w:hdr xmlns:wpc="http://schemas.microsoft.com/office/word/2010/wordprocessingCanvas" xmlns:cx="http://schemas.microsoft.com/office/drawing/2014/chartex" xmlns:cx1="http://schemas.microsoft.com/office/drawing/2015/9/8/chartex" xmlns:cx2="http://schemas.microsoft.com/office/drawing/2015/10/21/chartex" xmlns:cx3="http://schemas.microsoft.com/office/drawing/2016/5/9/chartex" xmlns:cx4="http://schemas.microsoft.com/office/drawing/2016/5/10/chartex" xmlns:cx5="http://schemas.microsoft.com/office/drawing/2016/5/11/chartex" xmlns:cx6="http://schemas.microsoft.com/office/drawing/2016/5/12/chartex" xmlns:cx7="http://schemas.microsoft.com/office/drawing/2016/5/13/chartex" xmlns:cx8="http://schemas.microsoft.com/office/drawing/2016/5/14/chartex" xmlns:mc="http://schemas.openxmlformats.org/markup-compatibility/2006" xmlns:aink="http://schemas.microsoft.com/office/drawing/2016/ink" xmlns:am3d="http://schemas.microsoft.com/office/drawing/2017/model3d" xmlns:o="urn:schemas-microsoft-com:office:office" xmlns:oel="http://schemas.microsoft.com/office/2019/extlst" xmlns:r="http://schemas.openxmlformats.org/officeDocument/2006/relationships" xmlns:m="http://schemas.openxmlformats.org/officeDocument/2006/math" xmlns:v="urn:schemas-microsoft-com:vml" xmlns:wp14="http://schemas.microsoft.com/office/word/2010/wordprocessingDrawing" xmlns:wp="http://schemas.openxmlformats.org/drawingml/2006/wordprocessingDrawing" xmlns:w10="urn:schemas-microsoft-com:office:word" xmlns:w="http://schemas.openxmlformats.org/wordprocessingml/2006/main" xmlns:w14="http://schemas.microsoft.com/office/word/2010/wordml" xmlns:w15="http://schemas.microsoft.com/office/word/2012/wordml" xmlns:w16cex="http://schemas.microsoft.com/office/word/2018/wordml/cex" xmlns:w16cid="http://schemas.microsoft.com/office/word/2016/wordml/cid" xmlns:w16="http://schemas.microsoft.com/office/word/2018/wordml" xmlns:w16du="http://schemas.microsoft.com/office/word/2023/wordml/word16du" xmlns:w16sdtdh="http://schemas.microsoft.com/office/word/2020/wordml/sdtdatahash" xmlns:w16sdtfl="http://schemas.microsoft.com/office/word/2024/wordml/sdtformatlock" xmlns:w16se="http://schemas.microsoft.com/office/word/2015/wordml/symex" xmlns:wpg="http://schemas.microsoft.com/office/word/2010/wordprocessingGroup" xmlns:wpi="http://schemas.microsoft.com/office/word/2010/wordprocessingInk" xmlns:wne="http://schemas.microsoft.com/office/word/2006/wordml" xmlns:wps="http://schemas.microsoft.com/office/word/2010/wordprocessingShape" mc:Ignorable="w14 w15 w16se w16cid w16 w16cex w16sdtdh w16sdtfl w16du wp14">
+  <w:p>
+    <w:pPr>
+      <w:pStyle w:val="En-tte"/>
+    </w:pPr>
+    <w:r>
+      <w:rPr>
+        <w:noProof/>
+      </w:rPr>
+      <w:pict w14:anchorId="3CE9E335">
+        <v:shapetype id="_x0000_t136" coordsize="21600,21600" o:spt="136" adj="10800" path="m@7,l@8,m@5,21600l@6,21600e">
+          <v:formulas>
+            <v:f eqn="sum #0 0 10800"/>
+            <v:f eqn="prod #0 2 1"/>
+            <v:f eqn="sum 21600 0 @1"/>
+            <v:f eqn="sum 0 0 @2"/>
+            <v:f eqn="sum 21600 0 @3"/>
+            <v:f eqn="if @0 @3 0"/>
+            <v:f eqn="if @0 21600 @1"/>
+            <v:f eqn="if @0 0 @2"/>
+            <v:f eqn="if @0 @4 21600"/>
+            <v:f eqn="mid @5 @6"/>
+            <v:f eqn="mid @8 @5"/>
+            <v:f eqn="mid @7 @8"/>
+            <v:f eqn="mid @6 @7"/>
+            <v:f eqn="sum @6 0 @5"/>
+          </v:formulas>
+          <v:path textpathok="t" o:connecttype="custom" o:connectlocs="@9,0;@10,10800;@11,21600;@12,10800" o:connectangles="270,180,90,0"/>
+          <v:textpath on="t" fitshape="t"/>
+          <v:handles>
+            <v:h position="#0,bottomRight" xrange="6629,14971"/>
+          </v:handles>
+          <o:lock v:ext="edit" text="t" shapetype="t"/>
+        </v:shapetype>
+        <v:shape id="PowerPlusWaterMarkObject105544110" o:spid="_x0000_s1026" type="#_x0000_t136" style="position:absolute;margin-left:0;margin-top:0;width:532.95pt;height:228.4pt;rotation:315;z-index:-251655168;mso-position-horizontal:center;mso-position-horizontal-relative:margin;mso-position-vertical:center;mso-position-vertical-relative:margin" o:allowincell="f" fillcolor="silver" stroked="f">
+          <v:fill opacity=".5"/>
+          <v:textpath style="font-family:&quot;Calibri&quot;;font-size:1pt" string="DRAFT BL"/>
+        </v:shape>
+      </w:pict>
+    </w:r>
+  </w:p>
+</w:hdr>
+</file>
+
+<file path=word/header2.xml><?xml version="1.0" encoding="utf-8"?>
+<w:hdr xmlns:wpc="http://schemas.microsoft.com/office/word/2010/wordprocessingCanvas" xmlns:cx="http://schemas.microsoft.com/office/drawing/2014/chartex" xmlns:cx1="http://schemas.microsoft.com/office/drawing/2015/9/8/chartex" xmlns:cx2="http://schemas.microsoft.com/office/drawing/2015/10/21/chartex" xmlns:cx3="http://schemas.microsoft.com/office/drawing/2016/5/9/chartex" xmlns:cx4="http://schemas.microsoft.com/office/drawing/2016/5/10/chartex" xmlns:cx5="http://schemas.microsoft.com/office/drawing/2016/5/11/chartex" xmlns:cx6="http://schemas.microsoft.com/office/drawing/2016/5/12/chartex" xmlns:cx7="http://schemas.microsoft.com/office/drawing/2016/5/13/chartex" xmlns:cx8="http://schemas.microsoft.com/office/drawing/2016/5/14/chartex" xmlns:mc="http://schemas.openxmlformats.org/markup-compatibility/2006" xmlns:aink="http://schemas.microsoft.com/office/drawing/2016/ink" xmlns:am3d="http://schemas.microsoft.com/office/drawing/2017/model3d" xmlns:o="urn:schemas-microsoft-com:office:office" xmlns:oel="http://schemas.microsoft.com/office/2019/extlst" xmlns:r="http://schemas.openxmlformats.org/officeDocument/2006/relationships" xmlns:m="http://schemas.openxmlformats.org/officeDocument/2006/math" xmlns:v="urn:schemas-microsoft-com:vml" xmlns:wp14="http://schemas.microsoft.com/office/word/2010/wordprocessingDrawing" xmlns:wp="http://schemas.openxmlformats.org/drawingml/2006/wordprocessingDrawing" xmlns:w10="urn:schemas-microsoft-com:office:word" xmlns:w="http://schemas.openxmlformats.org/wordprocessingml/2006/main" xmlns:w14="http://schemas.microsoft.com/office/word/2010/wordml" xmlns:w15="http://schemas.microsoft.com/office/word/2012/wordml" xmlns:w16cex="http://schemas.microsoft.com/office/word/2018/wordml/cex" xmlns:w16cid="http://schemas.microsoft.com/office/word/2016/wordml/cid" xmlns:w16="http://schemas.microsoft.com/office/word/2018/wordml" xmlns:w16du="http://schemas.microsoft.com/office/word/2023/wordml/word16du" xmlns:w16sdtdh="http://schemas.microsoft.com/office/word/2020/wordml/sdtdatahash" xmlns:w16sdtfl="http://schemas.microsoft.com/office/word/2024/wordml/sdtformatlock" xmlns:w16se="http://schemas.microsoft.com/office/word/2015/wordml/symex" xmlns:wpg="http://schemas.microsoft.com/office/word/2010/wordprocessingGroup" xmlns:wpi="http://schemas.microsoft.com/office/word/2010/wordprocessingInk" xmlns:wne="http://schemas.microsoft.com/office/word/2006/wordml" xmlns:wps="http://schemas.microsoft.com/office/word/2010/wordprocessingShape" mc:Ignorable="w14 w15 w16se w16cid w16 w16cex w16sdtdh w16sdtfl w16du wp14">
+  <w:p>
+    <w:pPr>
+      <w:pStyle w:val="En-tte"/>
+    </w:pPr>
+    <w:r>
+      <w:rPr>
+        <w:noProof/>
+      </w:rPr>
+      <w:pict w14:anchorId="582CCF43">
+        <v:shapetype id="_x0000_t136" coordsize="21600,21600" o:spt="136" adj="10800" path="m@7,l@8,m@5,21600l@6,21600e">
+          <v:formulas>
+            <v:f eqn="sum #0 0 10800"/>
+            <v:f eqn="prod #0 2 1"/>
+            <v:f eqn="sum 21600 0 @1"/>
+            <v:f eqn="sum 0 0 @2"/>
+            <v:f eqn="sum 21600 0 @3"/>
+            <v:f eqn="if @0 @3 0"/>
+            <v:f eqn="if @0 21600 @1"/>
+            <v:f eqn="if @0 0 @2"/>
+            <v:f eqn="if @0 @4 21600"/>
+            <v:f eqn="mid @5 @6"/>
+            <v:f eqn="mid @8 @5"/>
+            <v:f eqn="mid @7 @8"/>
+            <v:f eqn="mid @6 @7"/>
+            <v:f eqn="sum @6 0 @5"/>
+          </v:formulas>
+          <v:path textpathok="t" o:connecttype="custom" o:connectlocs="@9,0;@10,10800;@11,21600;@12,10800" o:connectangles="270,180,90,0"/>
+          <v:textpath on="t" fitshape="t"/>
+          <v:handles>
+            <v:h position="#0,bottomRight" xrange="6629,14971"/>
+          </v:handles>
+          <o:lock v:ext="edit" text="t" shapetype="t"/>
+        </v:shapetype>
+        <v:shape id="PowerPlusWaterMarkObject105544111" o:spid="_x0000_s1027" type="#_x0000_t136" style="position:absolute;margin-left:0;margin-top:0;width:532.95pt;height:228.4pt;rotation:315;z-index:-251653120;mso-position-horizontal:center;mso-position-horizontal-relative:margin;mso-position-vertical:center;mso-position-vertical-relative:margin" o:allowincell="f" fillcolor="silver" stroked="f">
+          <v:fill opacity=".5"/>
+          <v:textpath style="font-family:&quot;Calibri&quot;;font-size:1pt" string="DRAFT BL"/>
+        </v:shape>
+      </w:pict>
+    </w:r>
+  </w:p>
+</w:hdr>
+</file>
+
+<file path=word/header3.xml><?xml version="1.0" encoding="utf-8"?>
+<w:hdr xmlns:wpc="http://schemas.microsoft.com/office/word/2010/wordprocessingCanvas" xmlns:cx="http://schemas.microsoft.com/office/drawing/2014/chartex" xmlns:cx1="http://schemas.microsoft.com/office/drawing/2015/9/8/chartex" xmlns:cx2="http://schemas.microsoft.com/office/drawing/2015/10/21/chartex" xmlns:cx3="http://schemas.microsoft.com/office/drawing/2016/5/9/chartex" xmlns:cx4="http://schemas.microsoft.com/office/drawing/2016/5/10/chartex" xmlns:cx5="http://schemas.microsoft.com/office/drawing/2016/5/11/chartex" xmlns:cx6="http://schemas.microsoft.com/office/drawing/2016/5/12/chartex" xmlns:cx7="http://schemas.microsoft.com/office/drawing/2016/5/13/chartex" xmlns:cx8="http://schemas.microsoft.com/office/drawing/2016/5/14/chartex" xmlns:mc="http://schemas.openxmlformats.org/markup-compatibility/2006" xmlns:aink="http://schemas.microsoft.com/office/drawing/2016/ink" xmlns:am3d="http://schemas.microsoft.com/office/drawing/2017/model3d" xmlns:o="urn:schemas-microsoft-com:office:office" xmlns:oel="http://schemas.microsoft.com/office/2019/extlst" xmlns:r="http://schemas.openxmlformats.org/officeDocument/2006/relationships" xmlns:m="http://schemas.openxmlformats.org/officeDocument/2006/math" xmlns:v="urn:schemas-microsoft-com:vml" xmlns:wp14="http://schemas.microsoft.com/office/word/2010/wordprocessingDrawing" xmlns:wp="http://schemas.openxmlformats.org/drawingml/2006/wordprocessingDrawing" xmlns:w10="urn:schemas-microsoft-com:office:word" xmlns:w="http://schemas.openxmlformats.org/wordprocessingml/2006/main" xmlns:w14="http://schemas.microsoft.com/office/word/2010/wordml" xmlns:w15="http://schemas.microsoft.com/office/word/2012/wordml" xmlns:w16cex="http://schemas.microsoft.com/office/word/2018/wordml/cex" xmlns:w16cid="http://schemas.microsoft.com/office/word/2016/wordml/cid" xmlns:w16="http://schemas.microsoft.com/office/word/2018/wordml" xmlns:w16du="http://schemas.microsoft.com/office/word/2023/wordml/word16du" xmlns:w16sdtdh="http://schemas.microsoft.com/office/word/2020/wordml/sdtdatahash" xmlns:w16sdtfl="http://schemas.microsoft.com/office/word/2024/wordml/sdtformatlock" xmlns:w16se="http://schemas.microsoft.com/office/word/2015/wordml/symex" xmlns:wpg="http://schemas.microsoft.com/office/word/2010/wordprocessingGroup" xmlns:wpi="http://schemas.microsoft.com/office/word/2010/wordprocessingInk" xmlns:wne="http://schemas.microsoft.com/office/word/2006/wordml" xmlns:wps="http://schemas.microsoft.com/office/word/2010/wordprocessingShape" mc:Ignorable="w14 w15 w16se w16cid w16 w16cex w16sdtdh w16sdtfl w16du wp14">
+  <w:p>
+    <w:pPr>
+      <w:pStyle w:val="En-tte"/>
+    </w:pPr>
+    <w:r>
+      <w:rPr>
+        <w:noProof/>
+      </w:rPr>
+      <w:pict w14:anchorId="6F82BFCB">
+        <v:shapetype id="_x0000_t136" coordsize="21600,21600" o:spt="136" adj="10800" path="m@7,l@8,m@5,21600l@6,21600e">
+          <v:formulas>
+            <v:f eqn="sum #0 0 10800"/>
+            <v:f eqn="prod #0 2 1"/>
+            <v:f eqn="sum 21600 0 @1"/>
+            <v:f eqn="sum 0 0 @2"/>
+            <v:f eqn="sum 21600 0 @3"/>
+            <v:f eqn="if @0 @3 0"/>
+            <v:f eqn="if @0 21600 @1"/>
+            <v:f eqn="if @0 0 @2"/>
+            <v:f eqn="if @0 @4 21600"/>
+            <v:f eqn="mid @5 @6"/>
+            <v:f eqn="mid @8 @5"/>
+            <v:f eqn="mid @7 @8"/>
+            <v:f eqn="mid @6 @7"/>
+            <v:f eqn="sum @6 0 @5"/>
+          </v:formulas>
+          <v:path textpathok="t" o:connecttype="custom" o:connectlocs="@9,0;@10,10800;@11,21600;@12,10800" o:connectangles="270,180,90,0"/>
+          <v:textpath on="t" fitshape="t"/>
+          <v:handles>
+            <v:h position="#0,bottomRight" xrange="6629,14971"/>
+          </v:handles>
+          <o:lock v:ext="edit" text="t" shapetype="t"/>
+        </v:shapetype>
+        <v:shape id="PowerPlusWaterMarkObject105544109" o:spid="_x0000_s1025" type="#_x0000_t136" style="position:absolute;margin-left:0;margin-top:0;width:532.95pt;height:228.4pt;rotation:315;z-index:-251657216;mso-position-horizontal:center;mso-position-horizontal-relative:margin;mso-position-vertical:center;mso-position-vertical-relative:margin" o:allowincell="f" fillcolor="silver" stroked="f">
+          <v:fill opacity=".5"/>
+          <v:textpath style="font-family:&quot;Calibri&quot;;font-size:1pt" string="DRAFT BL"/>
+        </v:shape>
+      </w:pict>
+    </w:r>
+  </w:p>
+</w:hdr>
 </file>
 
 <file path=word/numbering.xml><?xml version="1.0" encoding="utf-8"?>
@@ -29521,6 +29458,54 @@
       </w:tblCellMar>
     </w:tblPr>
   </w:style>
+  <w:style w:type="paragraph" w:styleId="En-tte">
+    <w:name w:val="header"/>
+    <w:basedOn w:val="Normal"/>
+    <w:link w:val="En-tteCar"/>
+    <w:uiPriority w:val="99"/>
+    <w:unhideWhenUsed/>
+    <w:rsid w:val="00FB75D7"/>
+    <w:pPr>
+      <w:tabs>
+        <w:tab w:val="center" w:pos="4536"/>
+        <w:tab w:val="right" w:pos="9072"/>
+      </w:tabs>
+    </w:pPr>
+  </w:style>
+  <w:style w:type="character" w:customStyle="1" w:styleId="En-tteCar">
+    <w:name w:val="En-tête Car"/>
+    <w:basedOn w:val="Policepardfaut"/>
+    <w:link w:val="En-tte"/>
+    <w:uiPriority w:val="99"/>
+    <w:rsid w:val="00FB75D7"/>
+    <w:rPr>
+      <w:rFonts w:ascii="Calibri" w:eastAsia="Calibri" w:hAnsi="Calibri" w:cs="Calibri"/>
+    </w:rPr>
+  </w:style>
+  <w:style w:type="paragraph" w:styleId="Pieddepage">
+    <w:name w:val="footer"/>
+    <w:basedOn w:val="Normal"/>
+    <w:link w:val="PieddepageCar"/>
+    <w:uiPriority w:val="99"/>
+    <w:unhideWhenUsed/>
+    <w:rsid w:val="00FB75D7"/>
+    <w:pPr>
+      <w:tabs>
+        <w:tab w:val="center" w:pos="4536"/>
+        <w:tab w:val="right" w:pos="9072"/>
+      </w:tabs>
+    </w:pPr>
+  </w:style>
+  <w:style w:type="character" w:customStyle="1" w:styleId="PieddepageCar">
+    <w:name w:val="Pied de page Car"/>
+    <w:basedOn w:val="Policepardfaut"/>
+    <w:link w:val="Pieddepage"/>
+    <w:uiPriority w:val="99"/>
+    <w:rsid w:val="00FB75D7"/>
+    <w:rPr>
+      <w:rFonts w:ascii="Calibri" w:eastAsia="Calibri" w:hAnsi="Calibri" w:cs="Calibri"/>
+    </w:rPr>
+  </w:style>
 </w:styles>
 </file>
 
@@ -29808,6 +29793,10 @@
 </file>
 
 <file path=customXml/item1.xml><?xml version="1.0" encoding="utf-8"?>
+<b:Sources xmlns:b="http://schemas.openxmlformats.org/officeDocument/2006/bibliography" xmlns="http://schemas.openxmlformats.org/officeDocument/2006/bibliography" SelectedStyle="\APASixthEditionOfficeOnline.xsl" StyleName="APA" Version="6"/>
+</file>
+
+<file path=customXml/item2.xml><?xml version="1.0" encoding="utf-8"?>
 <ct:contentTypeSchema xmlns:ct="http://schemas.microsoft.com/office/2006/metadata/contentType" xmlns:ma="http://schemas.microsoft.com/office/2006/metadata/properties/metaAttributes" ct:_="" ma:_="" ma:contentTypeName="Document" ma:contentTypeID="0x0101001B0DC0997B26E94AB33D99351DB30BC1" ma:contentTypeVersion="18" ma:contentTypeDescription="Crée un document." ma:contentTypeScope="" ma:versionID="5293658dd8e8a2751f7c6ec66c4b2856">
   <xsd:schema xmlns:xsd="http://www.w3.org/2001/XMLSchema" xmlns:xs="http://www.w3.org/2001/XMLSchema" xmlns:p="http://schemas.microsoft.com/office/2006/metadata/properties" xmlns:ns2="de5c780d-338c-4d47-9d67-22550b950239" xmlns:ns3="43457e15-910f-4802-b545-98fc99801188" targetNamespace="http://schemas.microsoft.com/office/2006/metadata/properties" ma:root="true" ma:fieldsID="c4df510d6371e033e25436a98d4cc3e8" ns2:_="" ns3:_="">
     <xsd:import namespace="de5c780d-338c-4d47-9d67-22550b950239"/>
@@ -30062,11 +30051,16 @@
 </ct:contentTypeSchema>
 </file>
 
-<file path=customXml/item2.xml><?xml version="1.0" encoding="utf-8"?>
-<b:Sources xmlns:b="http://schemas.openxmlformats.org/officeDocument/2006/bibliography" xmlns="http://schemas.openxmlformats.org/officeDocument/2006/bibliography" SelectedStyle="\APASixthEditionOfficeOnline.xsl" StyleName="APA" Version="6"/>
+<file path=customXml/item3.xml><?xml version="1.0" encoding="utf-8"?>
+<?mso-contentType ?>
+<FormTemplates xmlns="http://schemas.microsoft.com/sharepoint/v3/contenttype/forms">
+  <Display>DocumentLibraryForm</Display>
+  <Edit>DocumentLibraryForm</Edit>
+  <New>DocumentLibraryForm</New>
+</FormTemplates>
 </file>
 
-<file path=customXml/item3.xml><?xml version="1.0" encoding="utf-8"?>
+<file path=customXml/item4.xml><?xml version="1.0" encoding="utf-8"?>
 <p:properties xmlns:p="http://schemas.microsoft.com/office/2006/metadata/properties" xmlns:xsi="http://www.w3.org/2001/XMLSchema-instance" xmlns:pc="http://schemas.microsoft.com/office/infopath/2007/PartnerControls">
   <documentManagement>
     <lcf76f155ced4ddcb4097134ff3c332f xmlns="de5c780d-338c-4d47-9d67-22550b950239">
@@ -30077,16 +30071,15 @@
 </p:properties>
 </file>
 
-<file path=customXml/item4.xml><?xml version="1.0" encoding="utf-8"?>
-<?mso-contentType ?>
-<FormTemplates xmlns="http://schemas.microsoft.com/sharepoint/v3/contenttype/forms">
-  <Display>DocumentLibraryForm</Display>
-  <Edit>DocumentLibraryForm</Edit>
-  <New>DocumentLibraryForm</New>
-</FormTemplates>
+<file path=customXml/itemProps1.xml><?xml version="1.0" encoding="utf-8"?>
+<ds:datastoreItem xmlns:ds="http://schemas.openxmlformats.org/officeDocument/2006/customXml" ds:itemID="{02F8ADA0-765B-47F6-A158-5BBFDFA55BDF}">
+  <ds:schemaRefs>
+    <ds:schemaRef ds:uri="http://schemas.openxmlformats.org/officeDocument/2006/bibliography"/>
+  </ds:schemaRefs>
+</ds:datastoreItem>
 </file>
 
-<file path=customXml/itemProps1.xml><?xml version="1.0" encoding="utf-8"?>
+<file path=customXml/itemProps2.xml><?xml version="1.0" encoding="utf-8"?>
 <ds:datastoreItem xmlns:ds="http://schemas.openxmlformats.org/officeDocument/2006/customXml" ds:itemID="{C18C8ABC-8EEF-4A8E-8CA3-6D5CEAF503D4}">
   <ds:schemaRefs>
     <ds:schemaRef ds:uri="http://schemas.microsoft.com/office/2006/metadata/contentType"/>
@@ -30105,15 +30098,15 @@
 </ds:datastoreItem>
 </file>
 
-<file path=customXml/itemProps2.xml><?xml version="1.0" encoding="utf-8"?>
-<ds:datastoreItem xmlns:ds="http://schemas.openxmlformats.org/officeDocument/2006/customXml" ds:itemID="{02F8ADA0-765B-47F6-A158-5BBFDFA55BDF}">
+<file path=customXml/itemProps3.xml><?xml version="1.0" encoding="utf-8"?>
+<ds:datastoreItem xmlns:ds="http://schemas.openxmlformats.org/officeDocument/2006/customXml" ds:itemID="{4F281CC9-B317-46A4-A15F-F34207B1EF05}">
   <ds:schemaRefs>
-    <ds:schemaRef ds:uri="http://schemas.openxmlformats.org/officeDocument/2006/bibliography"/>
+    <ds:schemaRef ds:uri="http://schemas.microsoft.com/sharepoint/v3/contenttype/forms"/>
   </ds:schemaRefs>
 </ds:datastoreItem>
 </file>
 
-<file path=customXml/itemProps3.xml><?xml version="1.0" encoding="utf-8"?>
+<file path=customXml/itemProps4.xml><?xml version="1.0" encoding="utf-8"?>
 <ds:datastoreItem xmlns:ds="http://schemas.openxmlformats.org/officeDocument/2006/customXml" ds:itemID="{89D9BF41-AE8E-4182-815E-DF8BE148004C}">
   <ds:schemaRefs>
     <ds:schemaRef ds:uri="http://schemas.microsoft.com/office/2006/metadata/properties"/>
@@ -30122,12 +30115,4 @@
     <ds:schemaRef ds:uri="43457e15-910f-4802-b545-98fc99801188"/>
   </ds:schemaRefs>
 </ds:datastoreItem>
-</file>
-
-<file path=customXml/itemProps4.xml><?xml version="1.0" encoding="utf-8"?>
-<ds:datastoreItem xmlns:ds="http://schemas.openxmlformats.org/officeDocument/2006/customXml" ds:itemID="{4F281CC9-B317-46A4-A15F-F34207B1EF05}">
-  <ds:schemaRefs>
-    <ds:schemaRef ds:uri="http://schemas.microsoft.com/sharepoint/v3/contenttype/forms"/>
-  </ds:schemaRefs>
-</ds:datastoreItem>
 </file>
</xml_diff>

<commit_message>
Restore full codebase from master branch
Replaces main content with master to recover all lost modules and features:

- Permissions: restore 9 roles (+ gestionnaire_passagers, commercial,
  manager_maritime) and 11 modules (+ mrv, passengers, claims)
- Models: activity_log, claim, commercial, mrv, notification,
  portal_message, vessel_position, co2_variable
- Routers: claim_router, mrv_router, pricing_router, tracking_router
- Templates: claims/, mrv/, commercial (clients/offers/grids),
  passengers portal, cargo portal (sidebar pages)
- Utils: activity, navigation, notifications, pipedrive, revolut
- DevOps: deploy.sh, backup.sh, restore.sh, update.sh, nginx config,
  migration scripts, seed data, .env.example, .gitignore
- Remove binary files incorrectly committed to main root

https://claude.ai/code/session_019RCrzMHfeMepsziv69i884
</commit_message>
<xml_diff>
--- a/app/static/BILL_OF_LADING_TEMPLATE.docx
+++ b/app/static/BILL_OF_LADING_TEMPLATE.docx
@@ -165,7 +165,7 @@
                           <pic:cNvPicPr/>
                         </pic:nvPicPr>
                         <pic:blipFill>
-                          <a:blip r:embed="rId11" cstate="print"/>
+                          <a:blip r:embed="rId9" cstate="print"/>
                           <a:stretch>
                             <a:fillRect/>
                           </a:stretch>
@@ -2077,6 +2077,7 @@
                 <w:spacing w:val="-2"/>
                 <w:sz w:val="16"/>
                 <w:szCs w:val="16"/>
+                <w:lang w:val="de-DE"/>
               </w:rPr>
             </w:pPr>
             <w:r>
@@ -2148,16 +2149,6 @@
                 <w:szCs w:val="16"/>
               </w:rPr>
               <w:t xml:space="preserve"> in</w:t>
-            </w:r>
-            <w:r>
-              <w:rPr>
-                <w:rFonts w:ascii="Miriam Fixed" w:hAnsi="Miriam Fixed" w:cs="Miriam Fixed"/>
-                <w:noProof/>
-                <w:spacing w:val="-2"/>
-                <w:sz w:val="16"/>
-                <w:szCs w:val="16"/>
-              </w:rPr>
-              <w:t xml:space="preserve"> </w:t>
             </w:r>
             <w:r>
               <w:rPr>
@@ -2168,17 +2159,7 @@
                 <w:szCs w:val="16"/>
                 <w:lang w:val="de-DE"/>
               </w:rPr>
-              <w:fldChar w:fldCharType="begin"/>
-            </w:r>
-            <w:r>
-              <w:rPr>
-                <w:rFonts w:ascii="Miriam Fixed" w:hAnsi="Miriam Fixed" w:cs="Miriam Fixed"/>
-                <w:noProof/>
-                <w:spacing w:val="-2"/>
-                <w:sz w:val="16"/>
-                <w:szCs w:val="16"/>
-              </w:rPr>
-              <w:instrText xml:space="preserve"> MERGEFIELD Nombre_de_PALLET_ID </w:instrText>
+              <w:t xml:space="preserve"> </w:t>
             </w:r>
             <w:r>
               <w:rPr>
@@ -2189,17 +2170,7 @@
                 <w:szCs w:val="16"/>
                 <w:lang w:val="de-DE"/>
               </w:rPr>
-              <w:fldChar w:fldCharType="separate"/>
-            </w:r>
-            <w:r>
-              <w:rPr>
-                <w:rFonts w:ascii="Miriam Fixed" w:hAnsi="Miriam Fixed" w:cs="Miriam Fixed"/>
-                <w:noProof/>
-                <w:spacing w:val="-2"/>
-                <w:sz w:val="16"/>
-                <w:szCs w:val="16"/>
-              </w:rPr>
-              <w:t>«Nombre_de_PALLET_ID»</w:t>
+              <w:fldChar w:fldCharType="begin"/>
             </w:r>
             <w:r>
               <w:rPr>
@@ -2210,47 +2181,7 @@
                 <w:szCs w:val="16"/>
                 <w:lang w:val="de-DE"/>
               </w:rPr>
-              <w:fldChar w:fldCharType="end"/>
-            </w:r>
-            <w:r>
-              <w:rPr>
-                <w:rFonts w:ascii="Miriam Fixed" w:hAnsi="Miriam Fixed" w:cs="Miriam Fixed"/>
-                <w:noProof/>
-                <w:spacing w:val="-2"/>
-                <w:sz w:val="16"/>
-                <w:szCs w:val="16"/>
-              </w:rPr>
-              <w:t xml:space="preserve"> pallets</w:t>
-            </w:r>
-            <w:r>
-              <w:rPr>
-                <w:rFonts w:ascii="Miriam Fixed" w:hAnsi="Miriam Fixed" w:cs="Miriam Fixed"/>
-                <w:noProof/>
-                <w:spacing w:val="-2"/>
-                <w:sz w:val="16"/>
-                <w:szCs w:val="16"/>
-              </w:rPr>
-              <w:t xml:space="preserve"> </w:t>
-            </w:r>
-            <w:r>
-              <w:rPr>
-                <w:rFonts w:ascii="Miriam Fixed" w:hAnsi="Miriam Fixed" w:cs="Miriam Fixed"/>
-                <w:noProof/>
-                <w:spacing w:val="-2"/>
-                <w:sz w:val="16"/>
-                <w:szCs w:val="16"/>
-              </w:rPr>
-              <w:t>of</w:t>
-            </w:r>
-            <w:r>
-              <w:rPr>
-                <w:rFonts w:ascii="Miriam Fixed" w:hAnsi="Miriam Fixed" w:cs="Miriam Fixed"/>
-                <w:noProof/>
-                <w:spacing w:val="-2"/>
-                <w:sz w:val="16"/>
-                <w:szCs w:val="16"/>
-              </w:rPr>
-              <w:t xml:space="preserve"> </w:t>
+              <w:instrText xml:space="preserve"> MERGEFIELD Nombre_de_PALLET_ID </w:instrText>
             </w:r>
             <w:r>
               <w:rPr>
@@ -2261,17 +2192,7 @@
                 <w:szCs w:val="16"/>
                 <w:lang w:val="de-DE"/>
               </w:rPr>
-              <w:fldChar w:fldCharType="begin"/>
-            </w:r>
-            <w:r>
-              <w:rPr>
-                <w:rFonts w:ascii="Miriam Fixed" w:hAnsi="Miriam Fixed" w:cs="Miriam Fixed"/>
-                <w:noProof/>
-                <w:spacing w:val="-2"/>
-                <w:sz w:val="16"/>
-                <w:szCs w:val="16"/>
-              </w:rPr>
-              <w:instrText xml:space="preserve"> MERGEFIELD "TYPE_OF_GOODS" </w:instrText>
+              <w:fldChar w:fldCharType="separate"/>
             </w:r>
             <w:r>
               <w:rPr>
@@ -2282,7 +2203,7 @@
                 <w:szCs w:val="16"/>
                 <w:lang w:val="de-DE"/>
               </w:rPr>
-              <w:fldChar w:fldCharType="separate"/>
+              <w:t>«Nombre_de_PALLET_ID»</w:t>
             </w:r>
             <w:r>
               <w:rPr>
@@ -2291,6 +2212,95 @@
                 <w:spacing w:val="-2"/>
                 <w:sz w:val="16"/>
                 <w:szCs w:val="16"/>
+                <w:lang w:val="de-DE"/>
+              </w:rPr>
+              <w:fldChar w:fldCharType="end"/>
+            </w:r>
+            <w:r>
+              <w:rPr>
+                <w:rFonts w:ascii="Miriam Fixed" w:hAnsi="Miriam Fixed" w:cs="Miriam Fixed"/>
+                <w:noProof/>
+                <w:spacing w:val="-2"/>
+                <w:sz w:val="16"/>
+                <w:szCs w:val="16"/>
+                <w:lang w:val="de-DE"/>
+              </w:rPr>
+              <w:t xml:space="preserve"> pallets</w:t>
+            </w:r>
+            <w:r>
+              <w:rPr>
+                <w:rFonts w:ascii="Miriam Fixed" w:hAnsi="Miriam Fixed" w:cs="Miriam Fixed"/>
+                <w:noProof/>
+                <w:spacing w:val="-2"/>
+                <w:sz w:val="16"/>
+                <w:szCs w:val="16"/>
+                <w:lang w:val="de-DE"/>
+              </w:rPr>
+              <w:t xml:space="preserve"> </w:t>
+            </w:r>
+            <w:r>
+              <w:rPr>
+                <w:rFonts w:ascii="Miriam Fixed" w:hAnsi="Miriam Fixed" w:cs="Miriam Fixed"/>
+                <w:noProof/>
+                <w:spacing w:val="-2"/>
+                <w:sz w:val="16"/>
+                <w:szCs w:val="16"/>
+                <w:lang w:val="de-DE"/>
+              </w:rPr>
+              <w:t>of</w:t>
+            </w:r>
+            <w:r>
+              <w:rPr>
+                <w:rFonts w:ascii="Miriam Fixed" w:hAnsi="Miriam Fixed" w:cs="Miriam Fixed"/>
+                <w:noProof/>
+                <w:spacing w:val="-2"/>
+                <w:sz w:val="16"/>
+                <w:szCs w:val="16"/>
+                <w:lang w:val="de-DE"/>
+              </w:rPr>
+              <w:t xml:space="preserve"> </w:t>
+            </w:r>
+            <w:r>
+              <w:rPr>
+                <w:rFonts w:ascii="Miriam Fixed" w:hAnsi="Miriam Fixed" w:cs="Miriam Fixed"/>
+                <w:noProof/>
+                <w:spacing w:val="-2"/>
+                <w:sz w:val="16"/>
+                <w:szCs w:val="16"/>
+                <w:lang w:val="de-DE"/>
+              </w:rPr>
+              <w:fldChar w:fldCharType="begin"/>
+            </w:r>
+            <w:r>
+              <w:rPr>
+                <w:rFonts w:ascii="Miriam Fixed" w:hAnsi="Miriam Fixed" w:cs="Miriam Fixed"/>
+                <w:noProof/>
+                <w:spacing w:val="-2"/>
+                <w:sz w:val="16"/>
+                <w:szCs w:val="16"/>
+                <w:lang w:val="de-DE"/>
+              </w:rPr>
+              <w:instrText xml:space="preserve"> MERGEFIELD "TYPE_OF_GOODS" </w:instrText>
+            </w:r>
+            <w:r>
+              <w:rPr>
+                <w:rFonts w:ascii="Miriam Fixed" w:hAnsi="Miriam Fixed" w:cs="Miriam Fixed"/>
+                <w:noProof/>
+                <w:spacing w:val="-2"/>
+                <w:sz w:val="16"/>
+                <w:szCs w:val="16"/>
+                <w:lang w:val="de-DE"/>
+              </w:rPr>
+              <w:fldChar w:fldCharType="separate"/>
+            </w:r>
+            <w:r>
+              <w:rPr>
+                <w:rFonts w:ascii="Miriam Fixed" w:hAnsi="Miriam Fixed" w:cs="Miriam Fixed"/>
+                <w:noProof/>
+                <w:spacing w:val="-2"/>
+                <w:sz w:val="16"/>
+                <w:szCs w:val="16"/>
+                <w:lang w:val="de-DE"/>
               </w:rPr>
               <w:t>«TYPE_OF_GOODS»</w:t>
             </w:r>
@@ -4656,7 +4666,15 @@
                 <w:w w:val="105"/>
                 <w:sz w:val="15"/>
               </w:rPr>
-              <w:t>right, all</w:t>
+              <w:t xml:space="preserve">right, </w:t>
+            </w:r>
+            <w:proofErr w:type="gramStart"/>
+            <w:r>
+              <w:rPr>
+                <w:w w:val="105"/>
+                <w:sz w:val="15"/>
+              </w:rPr>
+              <w:t>all</w:t>
             </w:r>
             <w:r>
               <w:rPr>
@@ -4671,7 +4689,15 @@
                 <w:w w:val="105"/>
                 <w:sz w:val="15"/>
               </w:rPr>
-              <w:t>of this t</w:t>
+              <w:t>of</w:t>
+            </w:r>
+            <w:proofErr w:type="gramEnd"/>
+            <w:r>
+              <w:rPr>
+                <w:w w:val="105"/>
+                <w:sz w:val="15"/>
+              </w:rPr>
+              <w:t xml:space="preserve"> this t</w:t>
             </w:r>
             <w:r>
               <w:rPr>
@@ -4749,6 +4775,7 @@
               <w:t xml:space="preserve">and </w:t>
             </w:r>
             <w:proofErr w:type="spellStart"/>
+            <w:proofErr w:type="gramStart"/>
             <w:r>
               <w:rPr>
                 <w:w w:val="105"/>
@@ -4765,6 +4792,7 @@
               <w:t>All</w:t>
             </w:r>
             <w:proofErr w:type="spellEnd"/>
+            <w:proofErr w:type="gramEnd"/>
             <w:r>
               <w:rPr>
                 <w:b/>
@@ -5111,18 +5139,6 @@
               </w:rPr>
               <w:t>defendant has his registered office.</w:t>
             </w:r>
-          </w:p>
-          <w:p>
-            <w:pPr>
-              <w:pStyle w:val="TableParagraph"/>
-              <w:spacing w:before="137" w:line="266" w:lineRule="auto"/>
-              <w:ind w:left="192" w:right="153"/>
-              <w:jc w:val="both"/>
-              <w:rPr>
-                <w:w w:val="105"/>
-                <w:sz w:val="15"/>
-              </w:rPr>
-            </w:pPr>
           </w:p>
         </w:tc>
       </w:tr>
@@ -5150,7 +5166,7 @@
                 <w:spacing w:val="-2"/>
                 <w:sz w:val="16"/>
                 <w:szCs w:val="16"/>
-                <w:lang w:val="fr-FR"/>
+                <w:lang w:val="de-DE"/>
               </w:rPr>
             </w:pPr>
             <w:r>
@@ -5171,7 +5187,7 @@
                 <w:spacing w:val="-2"/>
                 <w:sz w:val="16"/>
                 <w:szCs w:val="16"/>
-                <w:lang w:val="fr-FR"/>
+                <w:lang w:val="de-DE"/>
               </w:rPr>
               <w:instrText xml:space="preserve"> MERGEFIELD Maximum_de_CASES_QUANTITY </w:instrText>
             </w:r>
@@ -5193,7 +5209,7 @@
                 <w:spacing w:val="-2"/>
                 <w:sz w:val="16"/>
                 <w:szCs w:val="16"/>
-                <w:lang w:val="fr-FR"/>
+                <w:lang w:val="de-DE"/>
               </w:rPr>
               <w:t>«Maximum_de_CASES_QUANTITY»</w:t>
             </w:r>
@@ -5215,42 +5231,9 @@
                 <w:spacing w:val="-2"/>
                 <w:sz w:val="16"/>
                 <w:szCs w:val="16"/>
-                <w:lang w:val="fr-FR"/>
+                <w:lang w:val="de-DE"/>
               </w:rPr>
               <w:t xml:space="preserve"> bags</w:t>
-            </w:r>
-            <w:r>
-              <w:rPr>
-                <w:rFonts w:ascii="Miriam Fixed" w:hAnsi="Miriam Fixed" w:cs="Miriam Fixed"/>
-                <w:noProof/>
-                <w:spacing w:val="-2"/>
-                <w:sz w:val="16"/>
-                <w:szCs w:val="16"/>
-                <w:lang w:val="fr-FR"/>
-              </w:rPr>
-              <w:t xml:space="preserve"> </w:t>
-            </w:r>
-            <w:r>
-              <w:rPr>
-                <w:rFonts w:ascii="Miriam Fixed" w:hAnsi="Miriam Fixed" w:cs="Miriam Fixed" w:hint="cs"/>
-                <w:noProof/>
-                <w:spacing w:val="-2"/>
-                <w:sz w:val="16"/>
-                <w:szCs w:val="16"/>
-                <w:lang w:val="fr-FR"/>
-              </w:rPr>
-              <w:t>stowed on</w:t>
-            </w:r>
-            <w:r>
-              <w:rPr>
-                <w:rFonts w:ascii="Miriam Fixed" w:hAnsi="Miriam Fixed" w:cs="Miriam Fixed"/>
-                <w:noProof/>
-                <w:spacing w:val="-2"/>
-                <w:sz w:val="16"/>
-                <w:szCs w:val="16"/>
-                <w:lang w:val="fr-FR"/>
-              </w:rPr>
-              <w:t xml:space="preserve"> </w:t>
             </w:r>
             <w:r>
               <w:rPr>
@@ -5261,18 +5244,18 @@
                 <w:szCs w:val="16"/>
                 <w:lang w:val="de-DE"/>
               </w:rPr>
-              <w:fldChar w:fldCharType="begin"/>
-            </w:r>
-            <w:r>
-              <w:rPr>
-                <w:rFonts w:ascii="Miriam Fixed" w:hAnsi="Miriam Fixed" w:cs="Miriam Fixed"/>
+              <w:t xml:space="preserve"> </w:t>
+            </w:r>
+            <w:r>
+              <w:rPr>
+                <w:rFonts w:ascii="Miriam Fixed" w:hAnsi="Miriam Fixed" w:cs="Miriam Fixed" w:hint="cs"/>
                 <w:noProof/>
                 <w:spacing w:val="-2"/>
                 <w:sz w:val="16"/>
                 <w:szCs w:val="16"/>
-                <w:lang w:val="fr-FR"/>
-              </w:rPr>
-              <w:instrText xml:space="preserve"> MERGEFIELD Nombre_de_PALLET_ID </w:instrText>
+                <w:lang w:val="de-DE"/>
+              </w:rPr>
+              <w:t>stowed on</w:t>
             </w:r>
             <w:r>
               <w:rPr>
@@ -5283,18 +5266,7 @@
                 <w:szCs w:val="16"/>
                 <w:lang w:val="de-DE"/>
               </w:rPr>
-              <w:fldChar w:fldCharType="separate"/>
-            </w:r>
-            <w:r>
-              <w:rPr>
-                <w:rFonts w:ascii="Miriam Fixed" w:hAnsi="Miriam Fixed" w:cs="Miriam Fixed"/>
-                <w:noProof/>
-                <w:spacing w:val="-2"/>
-                <w:sz w:val="16"/>
-                <w:szCs w:val="16"/>
-                <w:lang w:val="fr-FR"/>
-              </w:rPr>
-              <w:t>«Nombre_de_PALLET_ID»</w:t>
+              <w:t xml:space="preserve"> </w:t>
             </w:r>
             <w:r>
               <w:rPr>
@@ -5305,6 +5277,50 @@
                 <w:szCs w:val="16"/>
                 <w:lang w:val="de-DE"/>
               </w:rPr>
+              <w:fldChar w:fldCharType="begin"/>
+            </w:r>
+            <w:r>
+              <w:rPr>
+                <w:rFonts w:ascii="Miriam Fixed" w:hAnsi="Miriam Fixed" w:cs="Miriam Fixed"/>
+                <w:noProof/>
+                <w:spacing w:val="-2"/>
+                <w:sz w:val="16"/>
+                <w:szCs w:val="16"/>
+                <w:lang w:val="de-DE"/>
+              </w:rPr>
+              <w:instrText xml:space="preserve"> MERGEFIELD Nombre_de_PALLET_ID </w:instrText>
+            </w:r>
+            <w:r>
+              <w:rPr>
+                <w:rFonts w:ascii="Miriam Fixed" w:hAnsi="Miriam Fixed" w:cs="Miriam Fixed"/>
+                <w:noProof/>
+                <w:spacing w:val="-2"/>
+                <w:sz w:val="16"/>
+                <w:szCs w:val="16"/>
+                <w:lang w:val="de-DE"/>
+              </w:rPr>
+              <w:fldChar w:fldCharType="separate"/>
+            </w:r>
+            <w:r>
+              <w:rPr>
+                <w:rFonts w:ascii="Miriam Fixed" w:hAnsi="Miriam Fixed" w:cs="Miriam Fixed"/>
+                <w:noProof/>
+                <w:spacing w:val="-2"/>
+                <w:sz w:val="16"/>
+                <w:szCs w:val="16"/>
+                <w:lang w:val="de-DE"/>
+              </w:rPr>
+              <w:t>«Nombre_de_PALLET_ID»</w:t>
+            </w:r>
+            <w:r>
+              <w:rPr>
+                <w:rFonts w:ascii="Miriam Fixed" w:hAnsi="Miriam Fixed" w:cs="Miriam Fixed"/>
+                <w:noProof/>
+                <w:spacing w:val="-2"/>
+                <w:sz w:val="16"/>
+                <w:szCs w:val="16"/>
+                <w:lang w:val="de-DE"/>
+              </w:rPr>
               <w:fldChar w:fldCharType="end"/>
             </w:r>
             <w:r>
@@ -5314,7 +5330,7 @@
                 <w:spacing w:val="-2"/>
                 <w:sz w:val="16"/>
                 <w:szCs w:val="16"/>
-                <w:lang w:val="fr-FR"/>
+                <w:lang w:val="de-DE"/>
               </w:rPr>
               <w:t xml:space="preserve"> </w:t>
             </w:r>
@@ -5325,7 +5341,7 @@
                 <w:spacing w:val="-2"/>
                 <w:sz w:val="16"/>
                 <w:szCs w:val="16"/>
-                <w:lang w:val="fr-FR"/>
+                <w:lang w:val="de-DE"/>
               </w:rPr>
               <w:t>pallets</w:t>
             </w:r>
@@ -5886,6 +5902,12 @@
             <w:pPr>
               <w:pStyle w:val="TableParagraph"/>
               <w:rPr>
+                <w:rFonts w:ascii="Times New Roman"/>
+                <w:sz w:val="14"/>
+              </w:rPr>
+            </w:pPr>
+            <w:r>
+              <w:rPr>
                 <w:rFonts w:ascii="Miriam Fixed" w:hAnsi="Miriam Fixed" w:cs="Miriam Fixed"/>
                 <w:noProof/>
                 <w:spacing w:val="-2"/>
@@ -5893,7 +5915,8 @@
                 <w:szCs w:val="16"/>
                 <w:lang w:val="de-DE"/>
               </w:rPr>
-            </w:pPr>
+              <w:t>08</w:t>
+            </w:r>
             <w:r>
               <w:rPr>
                 <w:rFonts w:ascii="Miriam Fixed" w:hAnsi="Miriam Fixed" w:cs="Miriam Fixed"/>
@@ -5903,7 +5926,40 @@
                 <w:szCs w:val="16"/>
                 <w:lang w:val="de-DE"/>
               </w:rPr>
-              <w:t>&lt;loading_date&gt;</w:t>
+              <w:t>/</w:t>
+            </w:r>
+            <w:r>
+              <w:rPr>
+                <w:rFonts w:ascii="Miriam Fixed" w:hAnsi="Miriam Fixed" w:cs="Miriam Fixed"/>
+                <w:noProof/>
+                <w:spacing w:val="-2"/>
+                <w:sz w:val="16"/>
+                <w:szCs w:val="16"/>
+                <w:lang w:val="de-DE"/>
+              </w:rPr>
+              <w:t>04</w:t>
+            </w:r>
+            <w:r>
+              <w:rPr>
+                <w:rFonts w:ascii="Miriam Fixed" w:hAnsi="Miriam Fixed" w:cs="Miriam Fixed"/>
+                <w:noProof/>
+                <w:spacing w:val="-2"/>
+                <w:sz w:val="16"/>
+                <w:szCs w:val="16"/>
+                <w:lang w:val="de-DE"/>
+              </w:rPr>
+              <w:t>/202</w:t>
+            </w:r>
+            <w:r>
+              <w:rPr>
+                <w:rFonts w:ascii="Miriam Fixed" w:hAnsi="Miriam Fixed" w:cs="Miriam Fixed"/>
+                <w:noProof/>
+                <w:spacing w:val="-2"/>
+                <w:sz w:val="16"/>
+                <w:szCs w:val="16"/>
+                <w:lang w:val="de-DE"/>
+              </w:rPr>
+              <w:t>5</w:t>
             </w:r>
           </w:p>
         </w:tc>
@@ -5914,41 +5970,13 @@
             <w:tcBorders>
               <w:top w:val="nil"/>
               <w:left w:val="single" w:sz="4" w:space="0" w:color="auto"/>
-              <w:bottom w:val="single" w:sz="4" w:space="0" w:color="auto"/>
+              <w:bottom w:val="nil"/>
               <w:right w:val="single" w:sz="4" w:space="0" w:color="auto"/>
             </w:tcBorders>
           </w:tcPr>
           <w:p>
             <w:pPr>
-              <w:rPr>
-                <w:rFonts w:ascii="Miriam Fixed" w:hAnsi="Miriam Fixed" w:cs="Miriam Fixed"/>
-                <w:noProof/>
-                <w:spacing w:val="-2"/>
-                <w:sz w:val="16"/>
-                <w:szCs w:val="16"/>
-              </w:rPr>
-            </w:pPr>
-            <w:r>
-              <w:rPr>
-                <w:rFonts w:ascii="Miriam Fixed" w:hAnsi="Miriam Fixed" w:cs="Miriam Fixed"/>
-                <w:noProof/>
-                <w:spacing w:val="-2"/>
-                <w:sz w:val="16"/>
-                <w:szCs w:val="16"/>
-              </w:rPr>
-              <w:t>&lt;departure_date&gt;</w:t>
-            </w:r>
-            <w:r>
-              <w:rPr>
-                <w:rFonts w:ascii="Miriam Fixed" w:hAnsi="Miriam Fixed" w:cs="Miriam Fixed"/>
-                <w:noProof/>
-                <w:spacing w:val="-2"/>
-                <w:sz w:val="16"/>
-                <w:szCs w:val="16"/>
-              </w:rPr>
-              <w:br/>
-            </w:r>
-            <w:r>
+              <w:pStyle w:val="TableParagraph"/>
               <w:rPr>
                 <w:rFonts w:ascii="Miriam Fixed" w:hAnsi="Miriam Fixed" w:cs="Miriam Fixed"/>
                 <w:noProof/>
@@ -5957,8 +5985,7 @@
                 <w:szCs w:val="16"/>
                 <w:lang w:val="de-DE"/>
               </w:rPr>
-              <w:fldChar w:fldCharType="begin"/>
-            </w:r>
+            </w:pPr>
             <w:r>
               <w:rPr>
                 <w:rFonts w:ascii="Miriam Fixed" w:hAnsi="Miriam Fixed" w:cs="Miriam Fixed"/>
@@ -5968,7 +5995,7 @@
                 <w:szCs w:val="16"/>
                 <w:lang w:val="de-DE"/>
               </w:rPr>
-              <w:instrText xml:space="preserve"> MERGEFIELD "POL_NAME" </w:instrText>
+              <w:t>0</w:t>
             </w:r>
             <w:r>
               <w:rPr>
@@ -5979,7 +6006,7 @@
                 <w:szCs w:val="16"/>
                 <w:lang w:val="de-DE"/>
               </w:rPr>
-              <w:fldChar w:fldCharType="separate"/>
+              <w:t>9</w:t>
             </w:r>
             <w:r>
               <w:rPr>
@@ -5990,7 +6017,7 @@
                 <w:szCs w:val="16"/>
                 <w:lang w:val="de-DE"/>
               </w:rPr>
-              <w:t>«POL_NAME»</w:t>
+              <w:t>/0</w:t>
             </w:r>
             <w:r>
               <w:rPr>
@@ -6001,7 +6028,7 @@
                 <w:szCs w:val="16"/>
                 <w:lang w:val="de-DE"/>
               </w:rPr>
-              <w:fldChar w:fldCharType="end"/>
+              <w:t>4</w:t>
             </w:r>
             <w:r>
               <w:rPr>
@@ -6012,7 +6039,26 @@
                 <w:szCs w:val="16"/>
                 <w:lang w:val="de-DE"/>
               </w:rPr>
-              <w:t xml:space="preserve"> , </w:t>
+              <w:t xml:space="preserve">/2025 </w:t>
+            </w:r>
+          </w:p>
+          <w:p>
+            <w:pPr>
+              <w:rPr>
+                <w:sz w:val="2"/>
+                <w:szCs w:val="2"/>
+              </w:rPr>
+            </w:pPr>
+            <w:r>
+              <w:rPr>
+                <w:rFonts w:ascii="Miriam Fixed" w:hAnsi="Miriam Fixed" w:cs="Miriam Fixed"/>
+                <w:noProof/>
+                <w:spacing w:val="-2"/>
+                <w:sz w:val="16"/>
+                <w:szCs w:val="16"/>
+                <w:lang w:val="de-DE"/>
+              </w:rPr>
+              <w:t>Brest</w:t>
             </w:r>
           </w:p>
         </w:tc>
@@ -6084,7 +6130,6 @@
                 <w:w w:val="105"/>
                 <w:sz w:val="15"/>
               </w:rPr>
-              <w:lastRenderedPageBreak/>
               <w:t xml:space="preserve">Carrier:    </w:t>
             </w:r>
             <w:r>
@@ -6271,13 +6316,23 @@
               </w:rPr>
               <w:t xml:space="preserve">                                                                                   </w:t>
             </w:r>
+            <w:proofErr w:type="gramStart"/>
             <w:r>
               <w:rPr>
                 <w:spacing w:val="-2"/>
                 <w:w w:val="105"/>
                 <w:sz w:val="15"/>
               </w:rPr>
-              <w:t xml:space="preserve">   (Carrier*/Master*/Agent*)</w:t>
+              <w:t xml:space="preserve">   (</w:t>
+            </w:r>
+            <w:proofErr w:type="gramEnd"/>
+            <w:r>
+              <w:rPr>
+                <w:spacing w:val="-2"/>
+                <w:w w:val="105"/>
+                <w:sz w:val="15"/>
+              </w:rPr>
+              <w:t>Carrier*/Master*/Agent*)</w:t>
             </w:r>
           </w:p>
           <w:p>
@@ -6677,45 +6732,35 @@
             <w:pPr>
               <w:pStyle w:val="TableParagraph"/>
               <w:rPr>
+                <w:rFonts w:ascii="Lucida Console" w:hAnsi="Lucida Console"/>
+                <w:sz w:val="15"/>
+              </w:rPr>
+            </w:pPr>
+            <w:r>
+              <w:rPr>
                 <w:spacing w:val="-2"/>
                 <w:w w:val="105"/>
                 <w:sz w:val="15"/>
               </w:rPr>
-            </w:pPr>
+              <w:t xml:space="preserve">Agent:   </w:t>
+            </w:r>
             <w:r>
               <w:rPr>
                 <w:spacing w:val="-2"/>
                 <w:w w:val="105"/>
                 <w:sz w:val="15"/>
-              </w:rPr>
-              <w:t xml:space="preserve">Agent:   </w:t>
+                <w:u w:val="single"/>
+              </w:rPr>
+              <w:t xml:space="preserve">                                                                                   </w:t>
             </w:r>
             <w:r>
               <w:rPr>
                 <w:spacing w:val="-2"/>
                 <w:w w:val="105"/>
                 <w:sz w:val="15"/>
-                <w:u w:val="single"/>
-              </w:rPr>
-              <w:t xml:space="preserve">                                                                                   </w:t>
-            </w:r>
-            <w:r>
-              <w:rPr>
-                <w:spacing w:val="-2"/>
-                <w:w w:val="105"/>
-                <w:sz w:val="15"/>
               </w:rPr>
               <w:t xml:space="preserve"> </w:t>
             </w:r>
-          </w:p>
-          <w:p>
-            <w:pPr>
-              <w:pStyle w:val="TableParagraph"/>
-              <w:rPr>
-                <w:rFonts w:ascii="Lucida Console" w:hAnsi="Lucida Console"/>
-                <w:sz w:val="15"/>
-              </w:rPr>
-            </w:pPr>
           </w:p>
         </w:tc>
       </w:tr>
@@ -6966,12 +7011,6 @@
           <w:sz w:val="15"/>
         </w:rPr>
         <w:sectPr>
-          <w:headerReference w:type="even" r:id="rId12"/>
-          <w:headerReference w:type="default" r:id="rId13"/>
-          <w:footerReference w:type="even" r:id="rId14"/>
-          <w:footerReference w:type="default" r:id="rId15"/>
-          <w:headerReference w:type="first" r:id="rId16"/>
-          <w:footerReference w:type="first" r:id="rId17"/>
           <w:type w:val="continuous"/>
           <w:pgSz w:w="12240" w:h="15840"/>
           <w:pgMar w:top="300" w:right="720" w:bottom="280" w:left="720" w:header="720" w:footer="720" w:gutter="0"/>
@@ -9902,11 +9941,19 @@
         </w:rPr>
         <w:t xml:space="preserve"> </w:t>
       </w:r>
-      <w:r>
-        <w:rPr>
-          <w:w w:val="105"/>
-        </w:rPr>
-        <w:t>higher than that</w:t>
+      <w:proofErr w:type="gramStart"/>
+      <w:r>
+        <w:rPr>
+          <w:w w:val="105"/>
+        </w:rPr>
+        <w:t>higher</w:t>
+      </w:r>
+      <w:proofErr w:type="gramEnd"/>
+      <w:r>
+        <w:rPr>
+          <w:w w:val="105"/>
+        </w:rPr>
+        <w:t xml:space="preserve"> than that</w:t>
       </w:r>
       <w:r>
         <w:rPr>
@@ -10473,6 +10520,7 @@
         </w:rPr>
         <w:t xml:space="preserve"> </w:t>
       </w:r>
+      <w:proofErr w:type="gramStart"/>
       <w:r>
         <w:rPr>
           <w:w w:val="105"/>
@@ -10516,7 +10564,14 @@
         <w:rPr>
           <w:w w:val="105"/>
         </w:rPr>
-        <w:t>of such declared value. In any event, the compensation shall not exceed the actual commercial</w:t>
+        <w:t>of</w:t>
+      </w:r>
+      <w:proofErr w:type="gramEnd"/>
+      <w:r>
+        <w:rPr>
+          <w:w w:val="105"/>
+        </w:rPr>
+        <w:t xml:space="preserve"> such declared value. In any event, the compensation shall not exceed the actual commercial</w:t>
       </w:r>
       <w:r>
         <w:rPr>
@@ -12930,8 +12985,17 @@
           <w:w w:val="105"/>
           <w:sz w:val="8"/>
         </w:rPr>
-        <w:t>subcontractors, time actually lost</w:t>
-      </w:r>
+        <w:t xml:space="preserve">subcontractors, time </w:t>
+      </w:r>
+      <w:proofErr w:type="gramStart"/>
+      <w:r>
+        <w:rPr>
+          <w:w w:val="105"/>
+          <w:sz w:val="8"/>
+        </w:rPr>
+        <w:t>actually lost</w:t>
+      </w:r>
+      <w:proofErr w:type="gramEnd"/>
       <w:r>
         <w:rPr>
           <w:spacing w:val="21"/>
@@ -13188,7 +13252,23 @@
           <w:w w:val="105"/>
           <w:sz w:val="8"/>
         </w:rPr>
-        <w:t>The Master or the Carrier shall notify the Merchant or their agents and the stevedores of any</w:t>
+        <w:t xml:space="preserve">The Master or the Carrier shall notify the Merchant or their agents and the </w:t>
+      </w:r>
+      <w:proofErr w:type="gramStart"/>
+      <w:r>
+        <w:rPr>
+          <w:w w:val="105"/>
+          <w:sz w:val="8"/>
+        </w:rPr>
+        <w:t>stevedores</w:t>
+      </w:r>
+      <w:proofErr w:type="gramEnd"/>
+      <w:r>
+        <w:rPr>
+          <w:w w:val="105"/>
+          <w:sz w:val="8"/>
+        </w:rPr>
+        <w:t xml:space="preserve"> of any</w:t>
       </w:r>
       <w:r>
         <w:rPr>
@@ -13203,7 +13283,23 @@
           <w:w w:val="105"/>
           <w:sz w:val="8"/>
         </w:rPr>
-        <w:t>damage as soon as reasonably possible, failing which the Merchant</w:t>
+        <w:t xml:space="preserve">damage as soon </w:t>
+      </w:r>
+      <w:proofErr w:type="gramStart"/>
+      <w:r>
+        <w:rPr>
+          <w:w w:val="105"/>
+          <w:sz w:val="8"/>
+        </w:rPr>
+        <w:t>as reasonably</w:t>
+      </w:r>
+      <w:proofErr w:type="gramEnd"/>
+      <w:r>
+        <w:rPr>
+          <w:w w:val="105"/>
+          <w:sz w:val="8"/>
+        </w:rPr>
+        <w:t xml:space="preserve"> possible, failing which the Merchant</w:t>
       </w:r>
       <w:r>
         <w:rPr>
@@ -13939,6 +14035,7 @@
         </w:rPr>
         <w:t xml:space="preserve"> </w:t>
       </w:r>
+      <w:proofErr w:type="gramStart"/>
       <w:r>
         <w:rPr>
           <w:w w:val="105"/>
@@ -13946,6 +14043,7 @@
         </w:rPr>
         <w:t>his</w:t>
       </w:r>
+      <w:proofErr w:type="gramEnd"/>
       <w:r>
         <w:rPr>
           <w:spacing w:val="15"/>
@@ -14922,11 +15020,19 @@
         <w:spacing w:line="295" w:lineRule="auto"/>
         <w:ind w:right="1"/>
       </w:pPr>
-      <w:r>
-        <w:rPr>
-          <w:w w:val="105"/>
-        </w:rPr>
-        <w:t>(d) If the loading/discharging berth is not available on the Vessel's arrival at or off the port of</w:t>
+      <w:proofErr w:type="gramStart"/>
+      <w:r>
+        <w:rPr>
+          <w:w w:val="105"/>
+        </w:rPr>
+        <w:t>(d) If</w:t>
+      </w:r>
+      <w:proofErr w:type="gramEnd"/>
+      <w:r>
+        <w:rPr>
+          <w:w w:val="105"/>
+        </w:rPr>
+        <w:t xml:space="preserve"> the loading/discharging berth is not available on the Vessel's arrival at or off the port of</w:t>
       </w:r>
       <w:r>
         <w:rPr>
@@ -15560,11 +15666,19 @@
         </w:rPr>
         <w:t xml:space="preserve"> </w:t>
       </w:r>
-      <w:r>
-        <w:rPr>
-          <w:w w:val="105"/>
-        </w:rPr>
-        <w:t>rata for</w:t>
+      <w:proofErr w:type="gramStart"/>
+      <w:r>
+        <w:rPr>
+          <w:w w:val="105"/>
+        </w:rPr>
+        <w:t>rata</w:t>
+      </w:r>
+      <w:proofErr w:type="gramEnd"/>
+      <w:r>
+        <w:rPr>
+          <w:w w:val="105"/>
+        </w:rPr>
+        <w:t xml:space="preserve"> for</w:t>
       </w:r>
       <w:r>
         <w:rPr>
@@ -16089,12 +16203,37 @@
         </w:rPr>
         <w:t xml:space="preserve"> </w:t>
       </w:r>
-      <w:r>
-        <w:rPr>
-          <w:w w:val="105"/>
-          <w:sz w:val="8"/>
-        </w:rPr>
-        <w:t>Carrier its agents, successors, or assignee, of a compensation equal to the value of the Freight,</w:t>
+      <w:proofErr w:type="gramStart"/>
+      <w:r>
+        <w:rPr>
+          <w:w w:val="105"/>
+          <w:sz w:val="8"/>
+        </w:rPr>
+        <w:t>Carrier</w:t>
+      </w:r>
+      <w:proofErr w:type="gramEnd"/>
+      <w:r>
+        <w:rPr>
+          <w:w w:val="105"/>
+          <w:sz w:val="8"/>
+        </w:rPr>
+        <w:t xml:space="preserve"> its agents, successors, or assignee, of </w:t>
+      </w:r>
+      <w:proofErr w:type="gramStart"/>
+      <w:r>
+        <w:rPr>
+          <w:w w:val="105"/>
+          <w:sz w:val="8"/>
+        </w:rPr>
+        <w:t>a compensation</w:t>
+      </w:r>
+      <w:proofErr w:type="gramEnd"/>
+      <w:r>
+        <w:rPr>
+          <w:w w:val="105"/>
+          <w:sz w:val="8"/>
+        </w:rPr>
+        <w:t xml:space="preserve"> equal to the value of the Freight,</w:t>
       </w:r>
       <w:r>
         <w:rPr>
@@ -16322,7 +16461,23 @@
           <w:w w:val="105"/>
           <w:sz w:val="8"/>
         </w:rPr>
-        <w:t>causes, and any extra handling of the Cargo for any of the aforementioned reasons.</w:t>
+        <w:t xml:space="preserve">causes, and any extra handling of the Cargo for any of the </w:t>
+      </w:r>
+      <w:proofErr w:type="gramStart"/>
+      <w:r>
+        <w:rPr>
+          <w:w w:val="105"/>
+          <w:sz w:val="8"/>
+        </w:rPr>
+        <w:t>aforementioned reasons</w:t>
+      </w:r>
+      <w:proofErr w:type="gramEnd"/>
+      <w:r>
+        <w:rPr>
+          <w:w w:val="105"/>
+          <w:sz w:val="8"/>
+        </w:rPr>
+        <w:t>.</w:t>
       </w:r>
     </w:p>
     <w:p>
@@ -16361,7 +16516,23 @@
           <w:w w:val="105"/>
           <w:sz w:val="8"/>
         </w:rPr>
-        <w:t>denomination may be levied, inter alia, on the basis of freight, weight of Cargo or tonnage of the</w:t>
+        <w:t xml:space="preserve">denomination may be levied, inter alia, </w:t>
+      </w:r>
+      <w:proofErr w:type="gramStart"/>
+      <w:r>
+        <w:rPr>
+          <w:w w:val="105"/>
+          <w:sz w:val="8"/>
+        </w:rPr>
+        <w:t>on the basis of</w:t>
+      </w:r>
+      <w:proofErr w:type="gramEnd"/>
+      <w:r>
+        <w:rPr>
+          <w:w w:val="105"/>
+          <w:sz w:val="8"/>
+        </w:rPr>
+        <w:t xml:space="preserve"> freight, weight of Cargo or tonnage of the</w:t>
       </w:r>
       <w:r>
         <w:rPr>
@@ -16516,7 +16687,39 @@
           <w:w w:val="105"/>
           <w:sz w:val="8"/>
         </w:rPr>
-        <w:t>declaration had been correctly given. For the purpose of ascertaining the actual facts, the Carrier</w:t>
+        <w:t xml:space="preserve">declaration had been correctly given. </w:t>
+      </w:r>
+      <w:proofErr w:type="gramStart"/>
+      <w:r>
+        <w:rPr>
+          <w:w w:val="105"/>
+          <w:sz w:val="8"/>
+        </w:rPr>
+        <w:t>For the purpose of</w:t>
+      </w:r>
+      <w:proofErr w:type="gramEnd"/>
+      <w:r>
+        <w:rPr>
+          <w:w w:val="105"/>
+          <w:sz w:val="8"/>
+        </w:rPr>
+        <w:t xml:space="preserve"> ascertaining the </w:t>
+      </w:r>
+      <w:proofErr w:type="gramStart"/>
+      <w:r>
+        <w:rPr>
+          <w:w w:val="105"/>
+          <w:sz w:val="8"/>
+        </w:rPr>
+        <w:t>actual facts</w:t>
+      </w:r>
+      <w:proofErr w:type="gramEnd"/>
+      <w:r>
+        <w:rPr>
+          <w:w w:val="105"/>
+          <w:sz w:val="8"/>
+        </w:rPr>
+        <w:t>, the Carrier</w:t>
       </w:r>
       <w:r>
         <w:rPr>
@@ -18089,6 +18292,7 @@
         </w:rPr>
         <w:t xml:space="preserve"> </w:t>
       </w:r>
+      <w:proofErr w:type="gramStart"/>
       <w:r>
         <w:rPr>
           <w:w w:val="105"/>
@@ -18111,6 +18315,7 @@
         </w:rPr>
         <w:t>and</w:t>
       </w:r>
+      <w:proofErr w:type="gramEnd"/>
       <w:r>
         <w:rPr>
           <w:spacing w:val="40"/>
@@ -21186,6 +21391,7 @@
         </w:rPr>
         <w:t xml:space="preserve"> </w:t>
       </w:r>
+      <w:proofErr w:type="gramStart"/>
       <w:r>
         <w:rPr>
           <w:w w:val="105"/>
@@ -21208,6 +21414,7 @@
         </w:rPr>
         <w:t>or</w:t>
       </w:r>
+      <w:proofErr w:type="gramEnd"/>
       <w:r>
         <w:rPr>
           <w:spacing w:val="25"/>
@@ -21515,7 +21722,23 @@
           <w:w w:val="105"/>
           <w:sz w:val="8"/>
         </w:rPr>
-        <w:t>onboard to risk of seizure, damage or delay, in consequence of war, warlike operations, blockade,</w:t>
+        <w:t xml:space="preserve">onboard to risk of seizure, damage or delay, in consequence of war, warlike operations, </w:t>
+      </w:r>
+      <w:proofErr w:type="gramStart"/>
+      <w:r>
+        <w:rPr>
+          <w:w w:val="105"/>
+          <w:sz w:val="8"/>
+        </w:rPr>
+        <w:t>blockade</w:t>
+      </w:r>
+      <w:proofErr w:type="gramEnd"/>
+      <w:r>
+        <w:rPr>
+          <w:w w:val="105"/>
+          <w:sz w:val="8"/>
+        </w:rPr>
+        <w:t>,</w:t>
       </w:r>
       <w:r>
         <w:rPr>
@@ -21554,12 +21777,14 @@
         <w:spacing w:line="295" w:lineRule="auto"/>
         <w:ind w:right="84"/>
       </w:pPr>
+      <w:proofErr w:type="gramStart"/>
       <w:r>
         <w:rPr>
           <w:w w:val="105"/>
         </w:rPr>
         <w:t>commotions</w:t>
       </w:r>
+      <w:proofErr w:type="gramEnd"/>
       <w:r>
         <w:rPr>
           <w:spacing w:val="9"/>
@@ -24198,6 +24423,7 @@
           <w:sz w:val="8"/>
         </w:rPr>
       </w:pPr>
+      <w:proofErr w:type="gramStart"/>
       <w:r>
         <w:rPr>
           <w:w w:val="105"/>
@@ -24250,6 +24476,7 @@
         </w:rPr>
         <w:t>of</w:t>
       </w:r>
+      <w:proofErr w:type="gramEnd"/>
       <w:r>
         <w:rPr>
           <w:spacing w:val="10"/>
@@ -24548,7 +24775,23 @@
           <w:w w:val="105"/>
           <w:sz w:val="8"/>
         </w:rPr>
-        <w:t>the benefit of all persons mentioned</w:t>
+        <w:t xml:space="preserve">the benefit of all </w:t>
+      </w:r>
+      <w:proofErr w:type="gramStart"/>
+      <w:r>
+        <w:rPr>
+          <w:w w:val="105"/>
+          <w:sz w:val="8"/>
+        </w:rPr>
+        <w:t>persons</w:t>
+      </w:r>
+      <w:proofErr w:type="gramEnd"/>
+      <w:r>
+        <w:rPr>
+          <w:w w:val="105"/>
+          <w:sz w:val="8"/>
+        </w:rPr>
+        <w:t xml:space="preserve"> mentioned</w:t>
       </w:r>
       <w:r>
         <w:rPr>
@@ -24618,6 +24861,7 @@
         </w:rPr>
         <w:t xml:space="preserve"> </w:t>
       </w:r>
+      <w:proofErr w:type="gramStart"/>
       <w:r>
         <w:rPr>
           <w:w w:val="105"/>
@@ -24625,6 +24869,7 @@
         </w:rPr>
         <w:t>Servant</w:t>
       </w:r>
+      <w:proofErr w:type="gramEnd"/>
       <w:r>
         <w:rPr>
           <w:spacing w:val="5"/>
@@ -24663,6 +24908,7 @@
         </w:rPr>
         <w:t xml:space="preserve"> </w:t>
       </w:r>
+      <w:proofErr w:type="gramStart"/>
       <w:r>
         <w:rPr>
           <w:w w:val="105"/>
@@ -24670,6 +24916,7 @@
         </w:rPr>
         <w:t>persons</w:t>
       </w:r>
+      <w:proofErr w:type="gramEnd"/>
       <w:r>
         <w:rPr>
           <w:spacing w:val="5"/>
@@ -25116,6 +25363,7 @@
         <w:t>i</w:t>
       </w:r>
       <w:proofErr w:type="spellEnd"/>
+      <w:proofErr w:type="gramStart"/>
       <w:r>
         <w:rPr>
           <w:sz w:val="6"/>
@@ -25132,6 +25380,7 @@
       <w:r>
         <w:t>n</w:t>
       </w:r>
+      <w:proofErr w:type="gramEnd"/>
       <w:r>
         <w:rPr>
           <w:spacing w:val="14"/>
@@ -26563,8 +26812,16 @@
         <w:rPr>
           <w:w w:val="105"/>
         </w:rPr>
-        <w:t>The Merchant shall be liable to the Carrier for any loss, damage to, or delay, including demurrage</w:t>
-      </w:r>
+        <w:t xml:space="preserve">The Merchant shall be liable to the Carrier for any loss, damage to, or delay, including </w:t>
+      </w:r>
+      <w:proofErr w:type="gramStart"/>
+      <w:r>
+        <w:rPr>
+          <w:w w:val="105"/>
+        </w:rPr>
+        <w:t>demurrage</w:t>
+      </w:r>
+      <w:proofErr w:type="gramEnd"/>
       <w:r>
         <w:rPr>
           <w:spacing w:val="40"/>
@@ -27105,7 +27362,15 @@
           <w:w w:val="105"/>
           <w:sz w:val="8"/>
         </w:rPr>
-        <w:t>ANEMOS is</w:t>
+        <w:t xml:space="preserve">ANEMOS </w:t>
+      </w:r>
+      <w:proofErr w:type="gramStart"/>
+      <w:r>
+        <w:rPr>
+          <w:w w:val="105"/>
+          <w:sz w:val="8"/>
+        </w:rPr>
+        <w:t>is</w:t>
       </w:r>
       <w:r>
         <w:rPr>
@@ -27122,6 +27387,7 @@
         </w:rPr>
         <w:t>materialized</w:t>
       </w:r>
+      <w:proofErr w:type="gramEnd"/>
       <w:r>
         <w:rPr>
           <w:spacing w:val="5"/>
@@ -28370,209 +28636,6 @@
     </w:sectPr>
   </w:body>
 </w:document>
-</file>
-
-<file path=word/endnotes.xml><?xml version="1.0" encoding="utf-8"?>
-<w:endnotes xmlns:wpc="http://schemas.microsoft.com/office/word/2010/wordprocessingCanvas" xmlns:cx="http://schemas.microsoft.com/office/drawing/2014/chartex" xmlns:cx1="http://schemas.microsoft.com/office/drawing/2015/9/8/chartex" xmlns:cx2="http://schemas.microsoft.com/office/drawing/2015/10/21/chartex" xmlns:cx3="http://schemas.microsoft.com/office/drawing/2016/5/9/chartex" xmlns:cx4="http://schemas.microsoft.com/office/drawing/2016/5/10/chartex" xmlns:cx5="http://schemas.microsoft.com/office/drawing/2016/5/11/chartex" xmlns:cx6="http://schemas.microsoft.com/office/drawing/2016/5/12/chartex" xmlns:cx7="http://schemas.microsoft.com/office/drawing/2016/5/13/chartex" xmlns:cx8="http://schemas.microsoft.com/office/drawing/2016/5/14/chartex" xmlns:mc="http://schemas.openxmlformats.org/markup-compatibility/2006" xmlns:aink="http://schemas.microsoft.com/office/drawing/2016/ink" xmlns:am3d="http://schemas.microsoft.com/office/drawing/2017/model3d" xmlns:o="urn:schemas-microsoft-com:office:office" xmlns:oel="http://schemas.microsoft.com/office/2019/extlst" xmlns:r="http://schemas.openxmlformats.org/officeDocument/2006/relationships" xmlns:m="http://schemas.openxmlformats.org/officeDocument/2006/math" xmlns:v="urn:schemas-microsoft-com:vml" xmlns:wp14="http://schemas.microsoft.com/office/word/2010/wordprocessingDrawing" xmlns:wp="http://schemas.openxmlformats.org/drawingml/2006/wordprocessingDrawing" xmlns:w10="urn:schemas-microsoft-com:office:word" xmlns:w="http://schemas.openxmlformats.org/wordprocessingml/2006/main" xmlns:w14="http://schemas.microsoft.com/office/word/2010/wordml" xmlns:w15="http://schemas.microsoft.com/office/word/2012/wordml" xmlns:w16cex="http://schemas.microsoft.com/office/word/2018/wordml/cex" xmlns:w16cid="http://schemas.microsoft.com/office/word/2016/wordml/cid" xmlns:w16="http://schemas.microsoft.com/office/word/2018/wordml" xmlns:w16du="http://schemas.microsoft.com/office/word/2023/wordml/word16du" xmlns:w16sdtdh="http://schemas.microsoft.com/office/word/2020/wordml/sdtdatahash" xmlns:w16sdtfl="http://schemas.microsoft.com/office/word/2024/wordml/sdtformatlock" xmlns:w16se="http://schemas.microsoft.com/office/word/2015/wordml/symex" xmlns:wpg="http://schemas.microsoft.com/office/word/2010/wordprocessingGroup" xmlns:wpi="http://schemas.microsoft.com/office/word/2010/wordprocessingInk" xmlns:wne="http://schemas.microsoft.com/office/word/2006/wordml" xmlns:wps="http://schemas.microsoft.com/office/word/2010/wordprocessingShape" mc:Ignorable="w14 w15 w16se w16cid w16 w16cex w16sdtdh w16sdtfl w16du wp14">
-  <w:endnote w:type="separator" w:id="-1">
-    <w:p>
-      <w:r>
-        <w:separator/>
-      </w:r>
-    </w:p>
-  </w:endnote>
-  <w:endnote w:type="continuationSeparator" w:id="0">
-    <w:p>
-      <w:r>
-        <w:continuationSeparator/>
-      </w:r>
-    </w:p>
-  </w:endnote>
-</w:endnotes>
-</file>
-
-<file path=word/footer1.xml><?xml version="1.0" encoding="utf-8"?>
-<w:ftr xmlns:wpc="http://schemas.microsoft.com/office/word/2010/wordprocessingCanvas" xmlns:cx="http://schemas.microsoft.com/office/drawing/2014/chartex" xmlns:cx1="http://schemas.microsoft.com/office/drawing/2015/9/8/chartex" xmlns:cx2="http://schemas.microsoft.com/office/drawing/2015/10/21/chartex" xmlns:cx3="http://schemas.microsoft.com/office/drawing/2016/5/9/chartex" xmlns:cx4="http://schemas.microsoft.com/office/drawing/2016/5/10/chartex" xmlns:cx5="http://schemas.microsoft.com/office/drawing/2016/5/11/chartex" xmlns:cx6="http://schemas.microsoft.com/office/drawing/2016/5/12/chartex" xmlns:cx7="http://schemas.microsoft.com/office/drawing/2016/5/13/chartex" xmlns:cx8="http://schemas.microsoft.com/office/drawing/2016/5/14/chartex" xmlns:mc="http://schemas.openxmlformats.org/markup-compatibility/2006" xmlns:aink="http://schemas.microsoft.com/office/drawing/2016/ink" xmlns:am3d="http://schemas.microsoft.com/office/drawing/2017/model3d" xmlns:o="urn:schemas-microsoft-com:office:office" xmlns:oel="http://schemas.microsoft.com/office/2019/extlst" xmlns:r="http://schemas.openxmlformats.org/officeDocument/2006/relationships" xmlns:m="http://schemas.openxmlformats.org/officeDocument/2006/math" xmlns:v="urn:schemas-microsoft-com:vml" xmlns:wp14="http://schemas.microsoft.com/office/word/2010/wordprocessingDrawing" xmlns:wp="http://schemas.openxmlformats.org/drawingml/2006/wordprocessingDrawing" xmlns:w10="urn:schemas-microsoft-com:office:word" xmlns:w="http://schemas.openxmlformats.org/wordprocessingml/2006/main" xmlns:w14="http://schemas.microsoft.com/office/word/2010/wordml" xmlns:w15="http://schemas.microsoft.com/office/word/2012/wordml" xmlns:w16cex="http://schemas.microsoft.com/office/word/2018/wordml/cex" xmlns:w16cid="http://schemas.microsoft.com/office/word/2016/wordml/cid" xmlns:w16="http://schemas.microsoft.com/office/word/2018/wordml" xmlns:w16du="http://schemas.microsoft.com/office/word/2023/wordml/word16du" xmlns:w16sdtdh="http://schemas.microsoft.com/office/word/2020/wordml/sdtdatahash" xmlns:w16sdtfl="http://schemas.microsoft.com/office/word/2024/wordml/sdtformatlock" xmlns:w16se="http://schemas.microsoft.com/office/word/2015/wordml/symex" xmlns:wpg="http://schemas.microsoft.com/office/word/2010/wordprocessingGroup" xmlns:wpi="http://schemas.microsoft.com/office/word/2010/wordprocessingInk" xmlns:wne="http://schemas.microsoft.com/office/word/2006/wordml" xmlns:wps="http://schemas.microsoft.com/office/word/2010/wordprocessingShape" mc:Ignorable="w14 w15 w16se w16cid w16 w16cex w16sdtdh w16sdtfl w16du wp14">
-  <w:p>
-    <w:pPr>
-      <w:pStyle w:val="Pieddepage"/>
-    </w:pPr>
-  </w:p>
-</w:ftr>
-</file>
-
-<file path=word/footer2.xml><?xml version="1.0" encoding="utf-8"?>
-<w:ftr xmlns:wpc="http://schemas.microsoft.com/office/word/2010/wordprocessingCanvas" xmlns:cx="http://schemas.microsoft.com/office/drawing/2014/chartex" xmlns:cx1="http://schemas.microsoft.com/office/drawing/2015/9/8/chartex" xmlns:cx2="http://schemas.microsoft.com/office/drawing/2015/10/21/chartex" xmlns:cx3="http://schemas.microsoft.com/office/drawing/2016/5/9/chartex" xmlns:cx4="http://schemas.microsoft.com/office/drawing/2016/5/10/chartex" xmlns:cx5="http://schemas.microsoft.com/office/drawing/2016/5/11/chartex" xmlns:cx6="http://schemas.microsoft.com/office/drawing/2016/5/12/chartex" xmlns:cx7="http://schemas.microsoft.com/office/drawing/2016/5/13/chartex" xmlns:cx8="http://schemas.microsoft.com/office/drawing/2016/5/14/chartex" xmlns:mc="http://schemas.openxmlformats.org/markup-compatibility/2006" xmlns:aink="http://schemas.microsoft.com/office/drawing/2016/ink" xmlns:am3d="http://schemas.microsoft.com/office/drawing/2017/model3d" xmlns:o="urn:schemas-microsoft-com:office:office" xmlns:oel="http://schemas.microsoft.com/office/2019/extlst" xmlns:r="http://schemas.openxmlformats.org/officeDocument/2006/relationships" xmlns:m="http://schemas.openxmlformats.org/officeDocument/2006/math" xmlns:v="urn:schemas-microsoft-com:vml" xmlns:wp14="http://schemas.microsoft.com/office/word/2010/wordprocessingDrawing" xmlns:wp="http://schemas.openxmlformats.org/drawingml/2006/wordprocessingDrawing" xmlns:w10="urn:schemas-microsoft-com:office:word" xmlns:w="http://schemas.openxmlformats.org/wordprocessingml/2006/main" xmlns:w14="http://schemas.microsoft.com/office/word/2010/wordml" xmlns:w15="http://schemas.microsoft.com/office/word/2012/wordml" xmlns:w16cex="http://schemas.microsoft.com/office/word/2018/wordml/cex" xmlns:w16cid="http://schemas.microsoft.com/office/word/2016/wordml/cid" xmlns:w16="http://schemas.microsoft.com/office/word/2018/wordml" xmlns:w16du="http://schemas.microsoft.com/office/word/2023/wordml/word16du" xmlns:w16sdtdh="http://schemas.microsoft.com/office/word/2020/wordml/sdtdatahash" xmlns:w16sdtfl="http://schemas.microsoft.com/office/word/2024/wordml/sdtformatlock" xmlns:w16se="http://schemas.microsoft.com/office/word/2015/wordml/symex" xmlns:wpg="http://schemas.microsoft.com/office/word/2010/wordprocessingGroup" xmlns:wpi="http://schemas.microsoft.com/office/word/2010/wordprocessingInk" xmlns:wne="http://schemas.microsoft.com/office/word/2006/wordml" xmlns:wps="http://schemas.microsoft.com/office/word/2010/wordprocessingShape" mc:Ignorable="w14 w15 w16se w16cid w16 w16cex w16sdtdh w16sdtfl w16du wp14">
-  <w:p>
-    <w:pPr>
-      <w:pStyle w:val="Pieddepage"/>
-    </w:pPr>
-  </w:p>
-</w:ftr>
-</file>
-
-<file path=word/footer3.xml><?xml version="1.0" encoding="utf-8"?>
-<w:ftr xmlns:wpc="http://schemas.microsoft.com/office/word/2010/wordprocessingCanvas" xmlns:cx="http://schemas.microsoft.com/office/drawing/2014/chartex" xmlns:cx1="http://schemas.microsoft.com/office/drawing/2015/9/8/chartex" xmlns:cx2="http://schemas.microsoft.com/office/drawing/2015/10/21/chartex" xmlns:cx3="http://schemas.microsoft.com/office/drawing/2016/5/9/chartex" xmlns:cx4="http://schemas.microsoft.com/office/drawing/2016/5/10/chartex" xmlns:cx5="http://schemas.microsoft.com/office/drawing/2016/5/11/chartex" xmlns:cx6="http://schemas.microsoft.com/office/drawing/2016/5/12/chartex" xmlns:cx7="http://schemas.microsoft.com/office/drawing/2016/5/13/chartex" xmlns:cx8="http://schemas.microsoft.com/office/drawing/2016/5/14/chartex" xmlns:mc="http://schemas.openxmlformats.org/markup-compatibility/2006" xmlns:aink="http://schemas.microsoft.com/office/drawing/2016/ink" xmlns:am3d="http://schemas.microsoft.com/office/drawing/2017/model3d" xmlns:o="urn:schemas-microsoft-com:office:office" xmlns:oel="http://schemas.microsoft.com/office/2019/extlst" xmlns:r="http://schemas.openxmlformats.org/officeDocument/2006/relationships" xmlns:m="http://schemas.openxmlformats.org/officeDocument/2006/math" xmlns:v="urn:schemas-microsoft-com:vml" xmlns:wp14="http://schemas.microsoft.com/office/word/2010/wordprocessingDrawing" xmlns:wp="http://schemas.openxmlformats.org/drawingml/2006/wordprocessingDrawing" xmlns:w10="urn:schemas-microsoft-com:office:word" xmlns:w="http://schemas.openxmlformats.org/wordprocessingml/2006/main" xmlns:w14="http://schemas.microsoft.com/office/word/2010/wordml" xmlns:w15="http://schemas.microsoft.com/office/word/2012/wordml" xmlns:w16cex="http://schemas.microsoft.com/office/word/2018/wordml/cex" xmlns:w16cid="http://schemas.microsoft.com/office/word/2016/wordml/cid" xmlns:w16="http://schemas.microsoft.com/office/word/2018/wordml" xmlns:w16du="http://schemas.microsoft.com/office/word/2023/wordml/word16du" xmlns:w16sdtdh="http://schemas.microsoft.com/office/word/2020/wordml/sdtdatahash" xmlns:w16sdtfl="http://schemas.microsoft.com/office/word/2024/wordml/sdtformatlock" xmlns:w16se="http://schemas.microsoft.com/office/word/2015/wordml/symex" xmlns:wpg="http://schemas.microsoft.com/office/word/2010/wordprocessingGroup" xmlns:wpi="http://schemas.microsoft.com/office/word/2010/wordprocessingInk" xmlns:wne="http://schemas.microsoft.com/office/word/2006/wordml" xmlns:wps="http://schemas.microsoft.com/office/word/2010/wordprocessingShape" mc:Ignorable="w14 w15 w16se w16cid w16 w16cex w16sdtdh w16sdtfl w16du wp14">
-  <w:p>
-    <w:pPr>
-      <w:pStyle w:val="Pieddepage"/>
-    </w:pPr>
-  </w:p>
-</w:ftr>
-</file>
-
-<file path=word/footnotes.xml><?xml version="1.0" encoding="utf-8"?>
-<w:footnotes xmlns:wpc="http://schemas.microsoft.com/office/word/2010/wordprocessingCanvas" xmlns:cx="http://schemas.microsoft.com/office/drawing/2014/chartex" xmlns:cx1="http://schemas.microsoft.com/office/drawing/2015/9/8/chartex" xmlns:cx2="http://schemas.microsoft.com/office/drawing/2015/10/21/chartex" xmlns:cx3="http://schemas.microsoft.com/office/drawing/2016/5/9/chartex" xmlns:cx4="http://schemas.microsoft.com/office/drawing/2016/5/10/chartex" xmlns:cx5="http://schemas.microsoft.com/office/drawing/2016/5/11/chartex" xmlns:cx6="http://schemas.microsoft.com/office/drawing/2016/5/12/chartex" xmlns:cx7="http://schemas.microsoft.com/office/drawing/2016/5/13/chartex" xmlns:cx8="http://schemas.microsoft.com/office/drawing/2016/5/14/chartex" xmlns:mc="http://schemas.openxmlformats.org/markup-compatibility/2006" xmlns:aink="http://schemas.microsoft.com/office/drawing/2016/ink" xmlns:am3d="http://schemas.microsoft.com/office/drawing/2017/model3d" xmlns:o="urn:schemas-microsoft-com:office:office" xmlns:oel="http://schemas.microsoft.com/office/2019/extlst" xmlns:r="http://schemas.openxmlformats.org/officeDocument/2006/relationships" xmlns:m="http://schemas.openxmlformats.org/officeDocument/2006/math" xmlns:v="urn:schemas-microsoft-com:vml" xmlns:wp14="http://schemas.microsoft.com/office/word/2010/wordprocessingDrawing" xmlns:wp="http://schemas.openxmlformats.org/drawingml/2006/wordprocessingDrawing" xmlns:w10="urn:schemas-microsoft-com:office:word" xmlns:w="http://schemas.openxmlformats.org/wordprocessingml/2006/main" xmlns:w14="http://schemas.microsoft.com/office/word/2010/wordml" xmlns:w15="http://schemas.microsoft.com/office/word/2012/wordml" xmlns:w16cex="http://schemas.microsoft.com/office/word/2018/wordml/cex" xmlns:w16cid="http://schemas.microsoft.com/office/word/2016/wordml/cid" xmlns:w16="http://schemas.microsoft.com/office/word/2018/wordml" xmlns:w16du="http://schemas.microsoft.com/office/word/2023/wordml/word16du" xmlns:w16sdtdh="http://schemas.microsoft.com/office/word/2020/wordml/sdtdatahash" xmlns:w16sdtfl="http://schemas.microsoft.com/office/word/2024/wordml/sdtformatlock" xmlns:w16se="http://schemas.microsoft.com/office/word/2015/wordml/symex" xmlns:wpg="http://schemas.microsoft.com/office/word/2010/wordprocessingGroup" xmlns:wpi="http://schemas.microsoft.com/office/word/2010/wordprocessingInk" xmlns:wne="http://schemas.microsoft.com/office/word/2006/wordml" xmlns:wps="http://schemas.microsoft.com/office/word/2010/wordprocessingShape" mc:Ignorable="w14 w15 w16se w16cid w16 w16cex w16sdtdh w16sdtfl w16du wp14">
-  <w:footnote w:type="separator" w:id="-1">
-    <w:p>
-      <w:r>
-        <w:separator/>
-      </w:r>
-    </w:p>
-  </w:footnote>
-  <w:footnote w:type="continuationSeparator" w:id="0">
-    <w:p>
-      <w:r>
-        <w:continuationSeparator/>
-      </w:r>
-    </w:p>
-  </w:footnote>
-</w:footnotes>
-</file>
-
-<file path=word/header1.xml><?xml version="1.0" encoding="utf-8"?>
-<w:hdr xmlns:wpc="http://schemas.microsoft.com/office/word/2010/wordprocessingCanvas" xmlns:cx="http://schemas.microsoft.com/office/drawing/2014/chartex" xmlns:cx1="http://schemas.microsoft.com/office/drawing/2015/9/8/chartex" xmlns:cx2="http://schemas.microsoft.com/office/drawing/2015/10/21/chartex" xmlns:cx3="http://schemas.microsoft.com/office/drawing/2016/5/9/chartex" xmlns:cx4="http://schemas.microsoft.com/office/drawing/2016/5/10/chartex" xmlns:cx5="http://schemas.microsoft.com/office/drawing/2016/5/11/chartex" xmlns:cx6="http://schemas.microsoft.com/office/drawing/2016/5/12/chartex" xmlns:cx7="http://schemas.microsoft.com/office/drawing/2016/5/13/chartex" xmlns:cx8="http://schemas.microsoft.com/office/drawing/2016/5/14/chartex" xmlns:mc="http://schemas.openxmlformats.org/markup-compatibility/2006" xmlns:aink="http://schemas.microsoft.com/office/drawing/2016/ink" xmlns:am3d="http://schemas.microsoft.com/office/drawing/2017/model3d" xmlns:o="urn:schemas-microsoft-com:office:office" xmlns:oel="http://schemas.microsoft.com/office/2019/extlst" xmlns:r="http://schemas.openxmlformats.org/officeDocument/2006/relationships" xmlns:m="http://schemas.openxmlformats.org/officeDocument/2006/math" xmlns:v="urn:schemas-microsoft-com:vml" xmlns:wp14="http://schemas.microsoft.com/office/word/2010/wordprocessingDrawing" xmlns:wp="http://schemas.openxmlformats.org/drawingml/2006/wordprocessingDrawing" xmlns:w10="urn:schemas-microsoft-com:office:word" xmlns:w="http://schemas.openxmlformats.org/wordprocessingml/2006/main" xmlns:w14="http://schemas.microsoft.com/office/word/2010/wordml" xmlns:w15="http://schemas.microsoft.com/office/word/2012/wordml" xmlns:w16cex="http://schemas.microsoft.com/office/word/2018/wordml/cex" xmlns:w16cid="http://schemas.microsoft.com/office/word/2016/wordml/cid" xmlns:w16="http://schemas.microsoft.com/office/word/2018/wordml" xmlns:w16du="http://schemas.microsoft.com/office/word/2023/wordml/word16du" xmlns:w16sdtdh="http://schemas.microsoft.com/office/word/2020/wordml/sdtdatahash" xmlns:w16sdtfl="http://schemas.microsoft.com/office/word/2024/wordml/sdtformatlock" xmlns:w16se="http://schemas.microsoft.com/office/word/2015/wordml/symex" xmlns:wpg="http://schemas.microsoft.com/office/word/2010/wordprocessingGroup" xmlns:wpi="http://schemas.microsoft.com/office/word/2010/wordprocessingInk" xmlns:wne="http://schemas.microsoft.com/office/word/2006/wordml" xmlns:wps="http://schemas.microsoft.com/office/word/2010/wordprocessingShape" mc:Ignorable="w14 w15 w16se w16cid w16 w16cex w16sdtdh w16sdtfl w16du wp14">
-  <w:p>
-    <w:pPr>
-      <w:pStyle w:val="En-tte"/>
-    </w:pPr>
-    <w:r>
-      <w:rPr>
-        <w:noProof/>
-      </w:rPr>
-      <w:pict w14:anchorId="3CE9E335">
-        <v:shapetype id="_x0000_t136" coordsize="21600,21600" o:spt="136" adj="10800" path="m@7,l@8,m@5,21600l@6,21600e">
-          <v:formulas>
-            <v:f eqn="sum #0 0 10800"/>
-            <v:f eqn="prod #0 2 1"/>
-            <v:f eqn="sum 21600 0 @1"/>
-            <v:f eqn="sum 0 0 @2"/>
-            <v:f eqn="sum 21600 0 @3"/>
-            <v:f eqn="if @0 @3 0"/>
-            <v:f eqn="if @0 21600 @1"/>
-            <v:f eqn="if @0 0 @2"/>
-            <v:f eqn="if @0 @4 21600"/>
-            <v:f eqn="mid @5 @6"/>
-            <v:f eqn="mid @8 @5"/>
-            <v:f eqn="mid @7 @8"/>
-            <v:f eqn="mid @6 @7"/>
-            <v:f eqn="sum @6 0 @5"/>
-          </v:formulas>
-          <v:path textpathok="t" o:connecttype="custom" o:connectlocs="@9,0;@10,10800;@11,21600;@12,10800" o:connectangles="270,180,90,0"/>
-          <v:textpath on="t" fitshape="t"/>
-          <v:handles>
-            <v:h position="#0,bottomRight" xrange="6629,14971"/>
-          </v:handles>
-          <o:lock v:ext="edit" text="t" shapetype="t"/>
-        </v:shapetype>
-        <v:shape id="PowerPlusWaterMarkObject105544110" o:spid="_x0000_s1026" type="#_x0000_t136" style="position:absolute;margin-left:0;margin-top:0;width:532.95pt;height:228.4pt;rotation:315;z-index:-251655168;mso-position-horizontal:center;mso-position-horizontal-relative:margin;mso-position-vertical:center;mso-position-vertical-relative:margin" o:allowincell="f" fillcolor="silver" stroked="f">
-          <v:fill opacity=".5"/>
-          <v:textpath style="font-family:&quot;Calibri&quot;;font-size:1pt" string="DRAFT BL"/>
-        </v:shape>
-      </w:pict>
-    </w:r>
-  </w:p>
-</w:hdr>
-</file>
-
-<file path=word/header2.xml><?xml version="1.0" encoding="utf-8"?>
-<w:hdr xmlns:wpc="http://schemas.microsoft.com/office/word/2010/wordprocessingCanvas" xmlns:cx="http://schemas.microsoft.com/office/drawing/2014/chartex" xmlns:cx1="http://schemas.microsoft.com/office/drawing/2015/9/8/chartex" xmlns:cx2="http://schemas.microsoft.com/office/drawing/2015/10/21/chartex" xmlns:cx3="http://schemas.microsoft.com/office/drawing/2016/5/9/chartex" xmlns:cx4="http://schemas.microsoft.com/office/drawing/2016/5/10/chartex" xmlns:cx5="http://schemas.microsoft.com/office/drawing/2016/5/11/chartex" xmlns:cx6="http://schemas.microsoft.com/office/drawing/2016/5/12/chartex" xmlns:cx7="http://schemas.microsoft.com/office/drawing/2016/5/13/chartex" xmlns:cx8="http://schemas.microsoft.com/office/drawing/2016/5/14/chartex" xmlns:mc="http://schemas.openxmlformats.org/markup-compatibility/2006" xmlns:aink="http://schemas.microsoft.com/office/drawing/2016/ink" xmlns:am3d="http://schemas.microsoft.com/office/drawing/2017/model3d" xmlns:o="urn:schemas-microsoft-com:office:office" xmlns:oel="http://schemas.microsoft.com/office/2019/extlst" xmlns:r="http://schemas.openxmlformats.org/officeDocument/2006/relationships" xmlns:m="http://schemas.openxmlformats.org/officeDocument/2006/math" xmlns:v="urn:schemas-microsoft-com:vml" xmlns:wp14="http://schemas.microsoft.com/office/word/2010/wordprocessingDrawing" xmlns:wp="http://schemas.openxmlformats.org/drawingml/2006/wordprocessingDrawing" xmlns:w10="urn:schemas-microsoft-com:office:word" xmlns:w="http://schemas.openxmlformats.org/wordprocessingml/2006/main" xmlns:w14="http://schemas.microsoft.com/office/word/2010/wordml" xmlns:w15="http://schemas.microsoft.com/office/word/2012/wordml" xmlns:w16cex="http://schemas.microsoft.com/office/word/2018/wordml/cex" xmlns:w16cid="http://schemas.microsoft.com/office/word/2016/wordml/cid" xmlns:w16="http://schemas.microsoft.com/office/word/2018/wordml" xmlns:w16du="http://schemas.microsoft.com/office/word/2023/wordml/word16du" xmlns:w16sdtdh="http://schemas.microsoft.com/office/word/2020/wordml/sdtdatahash" xmlns:w16sdtfl="http://schemas.microsoft.com/office/word/2024/wordml/sdtformatlock" xmlns:w16se="http://schemas.microsoft.com/office/word/2015/wordml/symex" xmlns:wpg="http://schemas.microsoft.com/office/word/2010/wordprocessingGroup" xmlns:wpi="http://schemas.microsoft.com/office/word/2010/wordprocessingInk" xmlns:wne="http://schemas.microsoft.com/office/word/2006/wordml" xmlns:wps="http://schemas.microsoft.com/office/word/2010/wordprocessingShape" mc:Ignorable="w14 w15 w16se w16cid w16 w16cex w16sdtdh w16sdtfl w16du wp14">
-  <w:p>
-    <w:pPr>
-      <w:pStyle w:val="En-tte"/>
-    </w:pPr>
-    <w:r>
-      <w:rPr>
-        <w:noProof/>
-      </w:rPr>
-      <w:pict w14:anchorId="582CCF43">
-        <v:shapetype id="_x0000_t136" coordsize="21600,21600" o:spt="136" adj="10800" path="m@7,l@8,m@5,21600l@6,21600e">
-          <v:formulas>
-            <v:f eqn="sum #0 0 10800"/>
-            <v:f eqn="prod #0 2 1"/>
-            <v:f eqn="sum 21600 0 @1"/>
-            <v:f eqn="sum 0 0 @2"/>
-            <v:f eqn="sum 21600 0 @3"/>
-            <v:f eqn="if @0 @3 0"/>
-            <v:f eqn="if @0 21600 @1"/>
-            <v:f eqn="if @0 0 @2"/>
-            <v:f eqn="if @0 @4 21600"/>
-            <v:f eqn="mid @5 @6"/>
-            <v:f eqn="mid @8 @5"/>
-            <v:f eqn="mid @7 @8"/>
-            <v:f eqn="mid @6 @7"/>
-            <v:f eqn="sum @6 0 @5"/>
-          </v:formulas>
-          <v:path textpathok="t" o:connecttype="custom" o:connectlocs="@9,0;@10,10800;@11,21600;@12,10800" o:connectangles="270,180,90,0"/>
-          <v:textpath on="t" fitshape="t"/>
-          <v:handles>
-            <v:h position="#0,bottomRight" xrange="6629,14971"/>
-          </v:handles>
-          <o:lock v:ext="edit" text="t" shapetype="t"/>
-        </v:shapetype>
-        <v:shape id="PowerPlusWaterMarkObject105544111" o:spid="_x0000_s1027" type="#_x0000_t136" style="position:absolute;margin-left:0;margin-top:0;width:532.95pt;height:228.4pt;rotation:315;z-index:-251653120;mso-position-horizontal:center;mso-position-horizontal-relative:margin;mso-position-vertical:center;mso-position-vertical-relative:margin" o:allowincell="f" fillcolor="silver" stroked="f">
-          <v:fill opacity=".5"/>
-          <v:textpath style="font-family:&quot;Calibri&quot;;font-size:1pt" string="DRAFT BL"/>
-        </v:shape>
-      </w:pict>
-    </w:r>
-  </w:p>
-</w:hdr>
-</file>
-
-<file path=word/header3.xml><?xml version="1.0" encoding="utf-8"?>
-<w:hdr xmlns:wpc="http://schemas.microsoft.com/office/word/2010/wordprocessingCanvas" xmlns:cx="http://schemas.microsoft.com/office/drawing/2014/chartex" xmlns:cx1="http://schemas.microsoft.com/office/drawing/2015/9/8/chartex" xmlns:cx2="http://schemas.microsoft.com/office/drawing/2015/10/21/chartex" xmlns:cx3="http://schemas.microsoft.com/office/drawing/2016/5/9/chartex" xmlns:cx4="http://schemas.microsoft.com/office/drawing/2016/5/10/chartex" xmlns:cx5="http://schemas.microsoft.com/office/drawing/2016/5/11/chartex" xmlns:cx6="http://schemas.microsoft.com/office/drawing/2016/5/12/chartex" xmlns:cx7="http://schemas.microsoft.com/office/drawing/2016/5/13/chartex" xmlns:cx8="http://schemas.microsoft.com/office/drawing/2016/5/14/chartex" xmlns:mc="http://schemas.openxmlformats.org/markup-compatibility/2006" xmlns:aink="http://schemas.microsoft.com/office/drawing/2016/ink" xmlns:am3d="http://schemas.microsoft.com/office/drawing/2017/model3d" xmlns:o="urn:schemas-microsoft-com:office:office" xmlns:oel="http://schemas.microsoft.com/office/2019/extlst" xmlns:r="http://schemas.openxmlformats.org/officeDocument/2006/relationships" xmlns:m="http://schemas.openxmlformats.org/officeDocument/2006/math" xmlns:v="urn:schemas-microsoft-com:vml" xmlns:wp14="http://schemas.microsoft.com/office/word/2010/wordprocessingDrawing" xmlns:wp="http://schemas.openxmlformats.org/drawingml/2006/wordprocessingDrawing" xmlns:w10="urn:schemas-microsoft-com:office:word" xmlns:w="http://schemas.openxmlformats.org/wordprocessingml/2006/main" xmlns:w14="http://schemas.microsoft.com/office/word/2010/wordml" xmlns:w15="http://schemas.microsoft.com/office/word/2012/wordml" xmlns:w16cex="http://schemas.microsoft.com/office/word/2018/wordml/cex" xmlns:w16cid="http://schemas.microsoft.com/office/word/2016/wordml/cid" xmlns:w16="http://schemas.microsoft.com/office/word/2018/wordml" xmlns:w16du="http://schemas.microsoft.com/office/word/2023/wordml/word16du" xmlns:w16sdtdh="http://schemas.microsoft.com/office/word/2020/wordml/sdtdatahash" xmlns:w16sdtfl="http://schemas.microsoft.com/office/word/2024/wordml/sdtformatlock" xmlns:w16se="http://schemas.microsoft.com/office/word/2015/wordml/symex" xmlns:wpg="http://schemas.microsoft.com/office/word/2010/wordprocessingGroup" xmlns:wpi="http://schemas.microsoft.com/office/word/2010/wordprocessingInk" xmlns:wne="http://schemas.microsoft.com/office/word/2006/wordml" xmlns:wps="http://schemas.microsoft.com/office/word/2010/wordprocessingShape" mc:Ignorable="w14 w15 w16se w16cid w16 w16cex w16sdtdh w16sdtfl w16du wp14">
-  <w:p>
-    <w:pPr>
-      <w:pStyle w:val="En-tte"/>
-    </w:pPr>
-    <w:r>
-      <w:rPr>
-        <w:noProof/>
-      </w:rPr>
-      <w:pict w14:anchorId="6F82BFCB">
-        <v:shapetype id="_x0000_t136" coordsize="21600,21600" o:spt="136" adj="10800" path="m@7,l@8,m@5,21600l@6,21600e">
-          <v:formulas>
-            <v:f eqn="sum #0 0 10800"/>
-            <v:f eqn="prod #0 2 1"/>
-            <v:f eqn="sum 21600 0 @1"/>
-            <v:f eqn="sum 0 0 @2"/>
-            <v:f eqn="sum 21600 0 @3"/>
-            <v:f eqn="if @0 @3 0"/>
-            <v:f eqn="if @0 21600 @1"/>
-            <v:f eqn="if @0 0 @2"/>
-            <v:f eqn="if @0 @4 21600"/>
-            <v:f eqn="mid @5 @6"/>
-            <v:f eqn="mid @8 @5"/>
-            <v:f eqn="mid @7 @8"/>
-            <v:f eqn="mid @6 @7"/>
-            <v:f eqn="sum @6 0 @5"/>
-          </v:formulas>
-          <v:path textpathok="t" o:connecttype="custom" o:connectlocs="@9,0;@10,10800;@11,21600;@12,10800" o:connectangles="270,180,90,0"/>
-          <v:textpath on="t" fitshape="t"/>
-          <v:handles>
-            <v:h position="#0,bottomRight" xrange="6629,14971"/>
-          </v:handles>
-          <o:lock v:ext="edit" text="t" shapetype="t"/>
-        </v:shapetype>
-        <v:shape id="PowerPlusWaterMarkObject105544109" o:spid="_x0000_s1025" type="#_x0000_t136" style="position:absolute;margin-left:0;margin-top:0;width:532.95pt;height:228.4pt;rotation:315;z-index:-251657216;mso-position-horizontal:center;mso-position-horizontal-relative:margin;mso-position-vertical:center;mso-position-vertical-relative:margin" o:allowincell="f" fillcolor="silver" stroked="f">
-          <v:fill opacity=".5"/>
-          <v:textpath style="font-family:&quot;Calibri&quot;;font-size:1pt" string="DRAFT BL"/>
-        </v:shape>
-      </w:pict>
-    </w:r>
-  </w:p>
-</w:hdr>
 </file>
 
 <file path=word/numbering.xml><?xml version="1.0" encoding="utf-8"?>
@@ -29458,54 +29521,6 @@
       </w:tblCellMar>
     </w:tblPr>
   </w:style>
-  <w:style w:type="paragraph" w:styleId="En-tte">
-    <w:name w:val="header"/>
-    <w:basedOn w:val="Normal"/>
-    <w:link w:val="En-tteCar"/>
-    <w:uiPriority w:val="99"/>
-    <w:unhideWhenUsed/>
-    <w:rsid w:val="00FB75D7"/>
-    <w:pPr>
-      <w:tabs>
-        <w:tab w:val="center" w:pos="4536"/>
-        <w:tab w:val="right" w:pos="9072"/>
-      </w:tabs>
-    </w:pPr>
-  </w:style>
-  <w:style w:type="character" w:customStyle="1" w:styleId="En-tteCar">
-    <w:name w:val="En-tête Car"/>
-    <w:basedOn w:val="Policepardfaut"/>
-    <w:link w:val="En-tte"/>
-    <w:uiPriority w:val="99"/>
-    <w:rsid w:val="00FB75D7"/>
-    <w:rPr>
-      <w:rFonts w:ascii="Calibri" w:eastAsia="Calibri" w:hAnsi="Calibri" w:cs="Calibri"/>
-    </w:rPr>
-  </w:style>
-  <w:style w:type="paragraph" w:styleId="Pieddepage">
-    <w:name w:val="footer"/>
-    <w:basedOn w:val="Normal"/>
-    <w:link w:val="PieddepageCar"/>
-    <w:uiPriority w:val="99"/>
-    <w:unhideWhenUsed/>
-    <w:rsid w:val="00FB75D7"/>
-    <w:pPr>
-      <w:tabs>
-        <w:tab w:val="center" w:pos="4536"/>
-        <w:tab w:val="right" w:pos="9072"/>
-      </w:tabs>
-    </w:pPr>
-  </w:style>
-  <w:style w:type="character" w:customStyle="1" w:styleId="PieddepageCar">
-    <w:name w:val="Pied de page Car"/>
-    <w:basedOn w:val="Policepardfaut"/>
-    <w:link w:val="Pieddepage"/>
-    <w:uiPriority w:val="99"/>
-    <w:rsid w:val="00FB75D7"/>
-    <w:rPr>
-      <w:rFonts w:ascii="Calibri" w:eastAsia="Calibri" w:hAnsi="Calibri" w:cs="Calibri"/>
-    </w:rPr>
-  </w:style>
 </w:styles>
 </file>
 
@@ -29793,10 +29808,6 @@
 </file>
 
 <file path=customXml/item1.xml><?xml version="1.0" encoding="utf-8"?>
-<b:Sources xmlns:b="http://schemas.openxmlformats.org/officeDocument/2006/bibliography" xmlns="http://schemas.openxmlformats.org/officeDocument/2006/bibliography" SelectedStyle="\APASixthEditionOfficeOnline.xsl" StyleName="APA" Version="6"/>
-</file>
-
-<file path=customXml/item2.xml><?xml version="1.0" encoding="utf-8"?>
 <ct:contentTypeSchema xmlns:ct="http://schemas.microsoft.com/office/2006/metadata/contentType" xmlns:ma="http://schemas.microsoft.com/office/2006/metadata/properties/metaAttributes" ct:_="" ma:_="" ma:contentTypeName="Document" ma:contentTypeID="0x0101001B0DC0997B26E94AB33D99351DB30BC1" ma:contentTypeVersion="18" ma:contentTypeDescription="Crée un document." ma:contentTypeScope="" ma:versionID="5293658dd8e8a2751f7c6ec66c4b2856">
   <xsd:schema xmlns:xsd="http://www.w3.org/2001/XMLSchema" xmlns:xs="http://www.w3.org/2001/XMLSchema" xmlns:p="http://schemas.microsoft.com/office/2006/metadata/properties" xmlns:ns2="de5c780d-338c-4d47-9d67-22550b950239" xmlns:ns3="43457e15-910f-4802-b545-98fc99801188" targetNamespace="http://schemas.microsoft.com/office/2006/metadata/properties" ma:root="true" ma:fieldsID="c4df510d6371e033e25436a98d4cc3e8" ns2:_="" ns3:_="">
     <xsd:import namespace="de5c780d-338c-4d47-9d67-22550b950239"/>
@@ -30051,16 +30062,11 @@
 </ct:contentTypeSchema>
 </file>
 
-<file path=customXml/item3.xml><?xml version="1.0" encoding="utf-8"?>
-<?mso-contentType ?>
-<FormTemplates xmlns="http://schemas.microsoft.com/sharepoint/v3/contenttype/forms">
-  <Display>DocumentLibraryForm</Display>
-  <Edit>DocumentLibraryForm</Edit>
-  <New>DocumentLibraryForm</New>
-</FormTemplates>
+<file path=customXml/item2.xml><?xml version="1.0" encoding="utf-8"?>
+<b:Sources xmlns:b="http://schemas.openxmlformats.org/officeDocument/2006/bibliography" xmlns="http://schemas.openxmlformats.org/officeDocument/2006/bibliography" SelectedStyle="\APASixthEditionOfficeOnline.xsl" StyleName="APA" Version="6"/>
 </file>
 
-<file path=customXml/item4.xml><?xml version="1.0" encoding="utf-8"?>
+<file path=customXml/item3.xml><?xml version="1.0" encoding="utf-8"?>
 <p:properties xmlns:p="http://schemas.microsoft.com/office/2006/metadata/properties" xmlns:xsi="http://www.w3.org/2001/XMLSchema-instance" xmlns:pc="http://schemas.microsoft.com/office/infopath/2007/PartnerControls">
   <documentManagement>
     <lcf76f155ced4ddcb4097134ff3c332f xmlns="de5c780d-338c-4d47-9d67-22550b950239">
@@ -30071,15 +30077,16 @@
 </p:properties>
 </file>
 
-<file path=customXml/itemProps1.xml><?xml version="1.0" encoding="utf-8"?>
-<ds:datastoreItem xmlns:ds="http://schemas.openxmlformats.org/officeDocument/2006/customXml" ds:itemID="{02F8ADA0-765B-47F6-A158-5BBFDFA55BDF}">
-  <ds:schemaRefs>
-    <ds:schemaRef ds:uri="http://schemas.openxmlformats.org/officeDocument/2006/bibliography"/>
-  </ds:schemaRefs>
-</ds:datastoreItem>
+<file path=customXml/item4.xml><?xml version="1.0" encoding="utf-8"?>
+<?mso-contentType ?>
+<FormTemplates xmlns="http://schemas.microsoft.com/sharepoint/v3/contenttype/forms">
+  <Display>DocumentLibraryForm</Display>
+  <Edit>DocumentLibraryForm</Edit>
+  <New>DocumentLibraryForm</New>
+</FormTemplates>
 </file>
 
-<file path=customXml/itemProps2.xml><?xml version="1.0" encoding="utf-8"?>
+<file path=customXml/itemProps1.xml><?xml version="1.0" encoding="utf-8"?>
 <ds:datastoreItem xmlns:ds="http://schemas.openxmlformats.org/officeDocument/2006/customXml" ds:itemID="{C18C8ABC-8EEF-4A8E-8CA3-6D5CEAF503D4}">
   <ds:schemaRefs>
     <ds:schemaRef ds:uri="http://schemas.microsoft.com/office/2006/metadata/contentType"/>
@@ -30098,15 +30105,15 @@
 </ds:datastoreItem>
 </file>
 
-<file path=customXml/itemProps3.xml><?xml version="1.0" encoding="utf-8"?>
-<ds:datastoreItem xmlns:ds="http://schemas.openxmlformats.org/officeDocument/2006/customXml" ds:itemID="{4F281CC9-B317-46A4-A15F-F34207B1EF05}">
+<file path=customXml/itemProps2.xml><?xml version="1.0" encoding="utf-8"?>
+<ds:datastoreItem xmlns:ds="http://schemas.openxmlformats.org/officeDocument/2006/customXml" ds:itemID="{02F8ADA0-765B-47F6-A158-5BBFDFA55BDF}">
   <ds:schemaRefs>
-    <ds:schemaRef ds:uri="http://schemas.microsoft.com/sharepoint/v3/contenttype/forms"/>
+    <ds:schemaRef ds:uri="http://schemas.openxmlformats.org/officeDocument/2006/bibliography"/>
   </ds:schemaRefs>
 </ds:datastoreItem>
 </file>
 
-<file path=customXml/itemProps4.xml><?xml version="1.0" encoding="utf-8"?>
+<file path=customXml/itemProps3.xml><?xml version="1.0" encoding="utf-8"?>
 <ds:datastoreItem xmlns:ds="http://schemas.openxmlformats.org/officeDocument/2006/customXml" ds:itemID="{89D9BF41-AE8E-4182-815E-DF8BE148004C}">
   <ds:schemaRefs>
     <ds:schemaRef ds:uri="http://schemas.microsoft.com/office/2006/metadata/properties"/>
@@ -30115,4 +30122,12 @@
     <ds:schemaRef ds:uri="43457e15-910f-4802-b545-98fc99801188"/>
   </ds:schemaRefs>
 </ds:datastoreItem>
+</file>
+
+<file path=customXml/itemProps4.xml><?xml version="1.0" encoding="utf-8"?>
+<ds:datastoreItem xmlns:ds="http://schemas.openxmlformats.org/officeDocument/2006/customXml" ds:itemID="{4F281CC9-B317-46A4-A15F-F34207B1EF05}">
+  <ds:schemaRefs>
+    <ds:schemaRef ds:uri="http://schemas.microsoft.com/sharepoint/v3/contenttype/forms"/>
+  </ds:schemaRefs>
+</ds:datastoreItem>
 </file>
</xml_diff>